<commit_message>
Practicals 1-3 and changes to syllabus and formative 2
</commit_message>
<xml_diff>
--- a/sost71032_syllabus/sost71032_syllabus.docx
+++ b/sost71032_syllabus/sost71032_syllabus.docx
@@ -5,7 +5,7 @@
     <w:p>
       <w:pPr>
         <w:pStyle w:val="Normal"/>
-        <w:spacing w:lineRule="auto" w:line="208" w:before="122" w:after="0"/>
+        <w:spacing w:lineRule="auto" w:line="206" w:before="122" w:after="0"/>
         <w:ind w:hanging="1614" w:left="4402"/>
         <w:jc w:val="center"/>
         <w:rPr>
@@ -17,7 +17,7 @@
       </w:pPr>
       <w:r>
         <w:drawing>
-          <wp:anchor behindDoc="0" distT="0" distB="0" distL="0" distR="0" simplePos="0" locked="0" layoutInCell="0" allowOverlap="1" relativeHeight="31">
+          <wp:anchor behindDoc="0" distT="0" distB="0" distL="0" distR="0" simplePos="0" locked="0" layoutInCell="0" allowOverlap="1" relativeHeight="52">
             <wp:simplePos x="0" y="0"/>
             <wp:positionH relativeFrom="page">
               <wp:posOffset>914400</wp:posOffset>
@@ -194,10 +194,9 @@
     <w:p>
       <w:pPr>
         <w:sectPr>
-          <w:type w:val="nextPage"/>
+          <w:type w:val="continuous"/>
           <w:pgSz w:w="12240" w:h="15840"/>
           <w:pgMar w:left="1320" w:right="1320" w:gutter="0" w:header="0" w:top="1460" w:footer="0" w:bottom="280"/>
-          <w:pgNumType w:fmt="decimal"/>
           <w:cols w:num="2" w:equalWidth="false" w:sep="false">
             <w:col w:w="6813" w:space="40"/>
             <w:col w:w="2746"/>
@@ -430,17 +429,18 @@
         </w:rPr>
       </w:pPr>
       <w:bookmarkStart w:id="0" w:name="_Hlk152597794"/>
+      <w:bookmarkEnd w:id="0"/>
       <w:r>
         <mc:AlternateContent>
           <mc:Choice Requires="wps">
             <w:drawing>
-              <wp:anchor behindDoc="1" distT="0" distB="0" distL="0" distR="0" simplePos="0" locked="0" layoutInCell="0" allowOverlap="1" relativeHeight="30" wp14:anchorId="7C547F44">
+              <wp:anchor behindDoc="1" distT="0" distB="0" distL="0" distR="0" simplePos="0" locked="0" layoutInCell="0" allowOverlap="1" relativeHeight="51" wp14:anchorId="7C547F44">
                 <wp:simplePos x="0" y="0"/>
                 <wp:positionH relativeFrom="page">
-                  <wp:posOffset>890905</wp:posOffset>
+                  <wp:posOffset>890270</wp:posOffset>
                 </wp:positionH>
                 <wp:positionV relativeFrom="paragraph">
-                  <wp:posOffset>243205</wp:posOffset>
+                  <wp:posOffset>242570</wp:posOffset>
                 </wp:positionV>
                 <wp:extent cx="5981700" cy="45085"/>
                 <wp:effectExtent l="0" t="0" r="0" b="0"/>
@@ -459,9 +459,9 @@
                           <a:avLst/>
                           <a:gdLst>
                             <a:gd name="textAreaLeft" fmla="*/ 0 w 3391200"/>
-                            <a:gd name="textAreaRight" fmla="*/ 3391560 w 3391200"/>
+                            <a:gd name="textAreaRight" fmla="*/ 3391920 w 3391200"/>
                             <a:gd name="textAreaTop" fmla="*/ -360 h 25560"/>
-                            <a:gd name="textAreaBottom" fmla="*/ 25560 h 25560"/>
+                            <a:gd name="textAreaBottom" fmla="*/ 25920 h 25560"/>
                           </a:gdLst>
                           <a:ahLst/>
                           <a:rect l="textAreaLeft" t="textAreaTop" r="textAreaRight" b="textAreaBottom"/>
@@ -502,7 +502,6 @@
           </mc:Fallback>
         </mc:AlternateContent>
       </w:r>
-      <w:bookmarkEnd w:id="0"/>
       <w:r>
         <w:rPr>
           <w:rFonts w:ascii="Georgia" w:hAnsi="Georgia"/>
@@ -578,6 +577,7 @@
             <w:rPr>
               <w:webHidden/>
               <w:rStyle w:val="IndexLink"/>
+              <w:vanish w:val="false"/>
             </w:rPr>
             <w:instrText xml:space="preserve"> TOC \z \o "1-2" \u \h</w:instrText>
           </w:r>
@@ -585,6 +585,7 @@
             <w:rPr>
               <w:webHidden/>
               <w:rStyle w:val="IndexLink"/>
+              <w:vanish w:val="false"/>
             </w:rPr>
             <w:fldChar w:fldCharType="separate"/>
           </w:r>
@@ -593,8 +594,15 @@
               <w:rPr>
                 <w:webHidden/>
                 <w:rStyle w:val="IndexLink"/>
+                <w:vanish w:val="false"/>
               </w:rPr>
               <w:t>1 Essential Information</w:t>
+            </w:r>
+            <w:r>
+              <w:rPr>
+                <w:rStyle w:val="IndexLink"/>
+                <w:vanish w:val="false"/>
+              </w:rPr>
               <w:tab/>
               <w:t>2</w:t>
             </w:r>
@@ -614,6 +622,7 @@
               <w:rPr>
                 <w:webHidden/>
                 <w:rStyle w:val="IndexLink"/>
+                <w:vanish w:val="false"/>
               </w:rPr>
               <w:t>2 Course Content</w:t>
               <w:tab/>
@@ -635,6 +644,7 @@
               <w:rPr>
                 <w:webHidden/>
                 <w:rStyle w:val="IndexLink"/>
+                <w:vanish w:val="false"/>
               </w:rPr>
               <w:t>2.1 Aims</w:t>
               <w:tab/>
@@ -656,6 +666,7 @@
               <w:rPr>
                 <w:webHidden/>
                 <w:rStyle w:val="IndexLink"/>
+                <w:vanish w:val="false"/>
               </w:rPr>
               <w:t>2.2 Learning Outcomes</w:t>
               <w:tab/>
@@ -677,6 +688,7 @@
               <w:rPr>
                 <w:webHidden/>
                 <w:rStyle w:val="IndexLink"/>
+                <w:vanish w:val="false"/>
               </w:rPr>
               <w:t>3 General Course Readings</w:t>
               <w:tab/>
@@ -698,6 +710,7 @@
               <w:rPr>
                 <w:webHidden/>
                 <w:rStyle w:val="IndexLink"/>
+                <w:vanish w:val="false"/>
               </w:rPr>
               <w:t>4 Course Plan</w:t>
               <w:tab/>
@@ -719,6 +732,7 @@
               <w:rPr>
                 <w:webHidden/>
                 <w:rStyle w:val="IndexLink"/>
+                <w:vanish w:val="false"/>
               </w:rPr>
               <w:t>5 Assessment</w:t>
               <w:tab/>
@@ -740,6 +754,7 @@
               <w:rPr>
                 <w:webHidden/>
                 <w:rStyle w:val="IndexLink"/>
+                <w:vanish w:val="false"/>
               </w:rPr>
               <w:t>5.1 Formative Assessment</w:t>
               <w:tab/>
@@ -761,6 +776,7 @@
               <w:rPr>
                 <w:webHidden/>
                 <w:rStyle w:val="IndexLink"/>
+                <w:vanish w:val="false"/>
               </w:rPr>
               <w:t>5.2 Summative Assessment</w:t>
               <w:tab/>
@@ -782,6 +798,7 @@
               <w:rPr>
                 <w:webHidden/>
                 <w:rStyle w:val="IndexLink"/>
+                <w:vanish w:val="false"/>
               </w:rPr>
               <w:t>5.3 Submission of Assignments</w:t>
               <w:tab/>
@@ -803,6 +820,7 @@
               <w:rPr>
                 <w:webHidden/>
                 <w:rStyle w:val="IndexLink"/>
+                <w:vanish w:val="false"/>
               </w:rPr>
               <w:t>6 Mitigating Circumstances</w:t>
               <w:tab/>
@@ -824,6 +842,7 @@
               <w:rPr>
                 <w:webHidden/>
                 <w:rStyle w:val="IndexLink"/>
+                <w:vanish w:val="false"/>
               </w:rPr>
               <w:t>7 Feedback</w:t>
               <w:tab/>
@@ -845,6 +864,7 @@
               <w:rPr>
                 <w:webHidden/>
                 <w:rStyle w:val="IndexLink"/>
+                <w:vanish w:val="false"/>
               </w:rPr>
               <w:t>8 Your Commitment</w:t>
               <w:tab/>
@@ -866,6 +886,7 @@
               <w:rPr>
                 <w:webHidden/>
                 <w:rStyle w:val="IndexLink"/>
+                <w:vanish w:val="false"/>
               </w:rPr>
               <w:t>8.1 Weekly lectures and readings</w:t>
               <w:tab/>
@@ -887,6 +908,7 @@
               <w:rPr>
                 <w:webHidden/>
                 <w:rStyle w:val="IndexLink"/>
+                <w:vanish w:val="false"/>
               </w:rPr>
               <w:t>8.2 Workshops: Preparation</w:t>
               <w:tab/>
@@ -908,6 +930,7 @@
               <w:rPr>
                 <w:webHidden/>
                 <w:rStyle w:val="IndexLink"/>
+                <w:vanish w:val="false"/>
               </w:rPr>
               <w:t>8.3 Attendance and absences</w:t>
               <w:tab/>
@@ -929,6 +952,7 @@
               <w:rPr>
                 <w:webHidden/>
                 <w:rStyle w:val="IndexLink"/>
+                <w:vanish w:val="false"/>
               </w:rPr>
               <w:t>8.4 Drop-ins</w:t>
               <w:tab/>
@@ -950,6 +974,7 @@
               <w:rPr>
                 <w:webHidden/>
                 <w:rStyle w:val="IndexLink"/>
+                <w:vanish w:val="false"/>
               </w:rPr>
               <w:t>8.5 Email and Canvas</w:t>
               <w:tab/>
@@ -971,6 +996,7 @@
               <w:rPr>
                 <w:webHidden/>
                 <w:rStyle w:val="IndexLink"/>
+                <w:vanish w:val="false"/>
               </w:rPr>
               <w:t>9 Assessment Criteria</w:t>
               <w:tab/>
@@ -980,6 +1006,7 @@
           <w:r>
             <w:rPr>
               <w:rStyle w:val="IndexLink"/>
+              <w:vanish w:val="false"/>
             </w:rPr>
             <w:fldChar w:fldCharType="end"/>
           </w:r>
@@ -1038,7 +1065,7 @@
           <w:ilvl w:val="0"/>
           <w:numId w:val="3"/>
         </w:numPr>
-        <w:spacing w:before="120" w:after="240"/>
+        <w:spacing w:before="0" w:after="240"/>
         <w:rPr>
           <w:rFonts w:ascii="Georgia" w:hAnsi="Georgia"/>
           <w:lang w:val="en-GB"/>
@@ -1407,47 +1434,7 @@
           <w:sz w:val="23"/>
           <w:lang w:val="en-GB"/>
         </w:rPr>
-        <w:t xml:space="preserve">Questions on the course content </w:t>
-      </w:r>
-      <w:r>
-        <w:rPr>
-          <w:rFonts w:ascii="Georgia" w:hAnsi="Georgia"/>
-          <w:sz w:val="23"/>
-          <w:lang w:val="en-GB"/>
-        </w:rPr>
-        <w:t>should</w:t>
-      </w:r>
-      <w:r>
-        <w:rPr>
-          <w:rFonts w:ascii="Georgia" w:hAnsi="Georgia"/>
-          <w:sz w:val="23"/>
-          <w:lang w:val="en-GB"/>
-        </w:rPr>
-        <w:t xml:space="preserve"> be asked in the </w:t>
-      </w:r>
-      <w:r>
-        <w:rPr>
-          <w:rFonts w:ascii="Georgia" w:hAnsi="Georgia"/>
-          <w:sz w:val="23"/>
-          <w:lang w:val="en-GB"/>
-        </w:rPr>
-        <w:t>lectures</w:t>
-      </w:r>
-      <w:r>
-        <w:rPr>
-          <w:rFonts w:ascii="Georgia" w:hAnsi="Georgia"/>
-          <w:sz w:val="23"/>
-          <w:lang w:val="en-GB"/>
-        </w:rPr>
-        <w:t xml:space="preserve">, </w:t>
-      </w:r>
-      <w:r>
-        <w:rPr>
-          <w:rFonts w:ascii="Georgia" w:hAnsi="Georgia"/>
-          <w:sz w:val="23"/>
-          <w:lang w:val="en-GB"/>
-        </w:rPr>
-        <w:t>practicals,</w:t>
+        <w:t>Questions on the course content should be asked in the lectures, practicals,</w:t>
       </w:r>
       <w:r>
         <w:rPr>
@@ -1512,25 +1499,7 @@
           <w:bCs w:val="false"/>
           <w:lang w:val="en-GB"/>
         </w:rPr>
-        <w:t xml:space="preserve">(check Canvas </w:t>
-      </w:r>
-      <w:r>
-        <w:rPr>
-          <w:rFonts w:ascii="Georgia" w:hAnsi="Georgia"/>
-          <w:b w:val="false"/>
-          <w:bCs w:val="false"/>
-          <w:lang w:val="en-GB"/>
-        </w:rPr>
-        <w:t xml:space="preserve">and personal timetables </w:t>
-      </w:r>
-      <w:r>
-        <w:rPr>
-          <w:rFonts w:ascii="Georgia" w:hAnsi="Georgia"/>
-          <w:b w:val="false"/>
-          <w:bCs w:val="false"/>
-          <w:lang w:val="en-GB"/>
-        </w:rPr>
-        <w:t>for updates)</w:t>
+        <w:t>(check Canvas and personal timetables for updates)</w:t>
       </w:r>
     </w:p>
     <w:p>
@@ -1592,34 +1561,7 @@
           <w:w w:val="105"/>
           <w:lang w:val="en-GB"/>
         </w:rPr>
-        <w:t xml:space="preserve">Mon, </w:t>
-      </w:r>
-      <w:r>
-        <w:rPr>
-          <w:rFonts w:ascii="Georgia" w:hAnsi="Georgia"/>
-          <w:spacing w:val="-1"/>
-          <w:w w:val="105"/>
-          <w:lang w:val="en-GB"/>
-        </w:rPr>
-        <w:t xml:space="preserve">2-4pm, </w:t>
-      </w:r>
-      <w:r>
-        <w:rPr>
-          <w:rFonts w:ascii="Georgia" w:hAnsi="Georgia"/>
-          <w:spacing w:val="-1"/>
-          <w:w w:val="105"/>
-          <w:lang w:val="en-GB"/>
-        </w:rPr>
-        <w:t>HBS G6</w:t>
-      </w:r>
-      <w:r>
-        <w:rPr>
-          <w:rFonts w:ascii="Georgia" w:hAnsi="Georgia"/>
-          <w:spacing w:val="-1"/>
-          <w:w w:val="105"/>
-          <w:lang w:val="en-GB"/>
-        </w:rPr>
-        <w:t>: 9 Mar, 16 Mar, 23 Mar, 20 Apr, 27 Apr.</w:t>
+        <w:t>Mon, 2-4pm, HBS G6: 9 Mar, 16 Mar, 23 Mar, 20 Apr, 27 Apr.</w:t>
       </w:r>
     </w:p>
     <w:p>
@@ -1647,43 +1589,7 @@
         </w:rPr>
         <w:tab/>
         <w:tab/>
-        <w:t xml:space="preserve">Fri, 2-4pm, </w:t>
-      </w:r>
-      <w:r>
-        <w:rPr>
-          <w:rFonts w:ascii="Georgia" w:hAnsi="Georgia"/>
-          <w:spacing w:val="-1"/>
-          <w:w w:val="105"/>
-          <w:lang w:val="en-GB"/>
-        </w:rPr>
-        <w:t>HBS G32</w:t>
-      </w:r>
-      <w:r>
-        <w:rPr>
-          <w:rFonts w:ascii="Georgia" w:hAnsi="Georgia"/>
-          <w:spacing w:val="-1"/>
-          <w:w w:val="105"/>
-          <w:lang w:val="en-GB"/>
-        </w:rPr>
-        <w:t xml:space="preserve">: 8 May </w:t>
-      </w:r>
-      <w:r>
-        <w:rPr>
-          <w:rFonts w:ascii="Georgia" w:hAnsi="Georgia"/>
-          <w:spacing w:val="-1"/>
-          <w:w w:val="105"/>
-          <w:lang w:val="en-GB"/>
-        </w:rPr>
-        <w:t>(rescheduled due to bank holiday)</w:t>
-      </w:r>
-      <w:r>
-        <w:rPr>
-          <w:rFonts w:ascii="Georgia" w:hAnsi="Georgia"/>
-          <w:spacing w:val="-1"/>
-          <w:w w:val="105"/>
-          <w:lang w:val="en-GB"/>
-        </w:rPr>
-        <w:t>.</w:t>
+        <w:t>Fri, 2-4pm, HBS G32: 8 May (rescheduled due to bank holiday).</w:t>
       </w:r>
     </w:p>
     <w:p>
@@ -1707,37 +1613,10 @@
           <w:rFonts w:ascii="Georgia" w:hAnsi="Georgia"/>
           <w:lang w:val="en-GB"/>
         </w:rPr>
-        <w:t>Practicals</w:t>
-      </w:r>
-      <w:r>
-        <w:rPr>
-          <w:rFonts w:ascii="Georgia" w:hAnsi="Georgia"/>
-          <w:lang w:val="en-GB"/>
-        </w:rPr>
-        <w:t>:</w:t>
+        <w:t>Practicals:</w:t>
         <w:tab/>
         <w:tab/>
-      </w:r>
-      <w:r>
-        <w:rPr>
-          <w:rFonts w:ascii="Georgia" w:hAnsi="Georgia"/>
-          <w:lang w:val="en-GB"/>
-        </w:rPr>
-        <w:t>Mon</w:t>
-      </w:r>
-      <w:r>
-        <w:rPr>
-          <w:rFonts w:ascii="Georgia" w:hAnsi="Georgia"/>
-          <w:lang w:val="en-GB"/>
-        </w:rPr>
-        <w:t xml:space="preserve">, </w:t>
-      </w:r>
-      <w:r>
-        <w:rPr>
-          <w:rFonts w:ascii="Georgia" w:hAnsi="Georgia"/>
-          <w:lang w:val="en-GB"/>
-        </w:rPr>
-        <w:t>4-6pm:</w:t>
+        <w:t>Mon, 4-6pm:</w:t>
       </w:r>
       <w:r>
         <w:rPr>
@@ -1746,34 +1625,7 @@
           <w:w w:val="105"/>
           <w:lang w:val="en-GB"/>
         </w:rPr>
-        <w:t xml:space="preserve"> </w:t>
-      </w:r>
-      <w:r>
-        <w:rPr>
-          <w:rFonts w:ascii="Georgia" w:hAnsi="Georgia"/>
-          <w:spacing w:val="-1"/>
-          <w:w w:val="105"/>
-          <w:lang w:val="en-GB"/>
-        </w:rPr>
-        <w:t xml:space="preserve">9 Mar, 16 Mar, 23 Mar, 20 Apr, 27 Apr, </w:t>
-      </w:r>
-      <w:r>
-        <w:rPr>
-          <w:rFonts w:ascii="Georgia" w:hAnsi="Georgia"/>
-          <w:spacing w:val="-1"/>
-          <w:w w:val="105"/>
-          <w:lang w:val="en-GB"/>
-        </w:rPr>
-        <w:t>11 May</w:t>
-      </w:r>
-      <w:r>
-        <w:rPr>
-          <w:rFonts w:ascii="Georgia" w:hAnsi="Georgia"/>
-          <w:spacing w:val="-1"/>
-          <w:w w:val="105"/>
-          <w:lang w:val="en-GB"/>
-        </w:rPr>
-        <w:t xml:space="preserve">. </w:t>
+        <w:t xml:space="preserve"> 9 Mar, 16 Mar, 23 Mar, 20 Apr, 27 Apr, 11 May. </w:t>
       </w:r>
     </w:p>
     <w:p>
@@ -1800,25 +1652,7 @@
           <w:lang w:val="en-GB"/>
         </w:rPr>
         <w:tab/>
-        <w:t xml:space="preserve">Location: </w:t>
-      </w:r>
-      <w:r>
-        <w:rPr>
-          <w:rFonts w:ascii="Georgia" w:hAnsi="Georgia"/>
-          <w:spacing w:val="-1"/>
-          <w:w w:val="105"/>
-          <w:lang w:val="en-GB"/>
-        </w:rPr>
-        <w:t>Simon 2.61</w:t>
-      </w:r>
-      <w:r>
-        <w:rPr>
-          <w:rFonts w:ascii="Georgia" w:hAnsi="Georgia"/>
-          <w:spacing w:val="-1"/>
-          <w:w w:val="105"/>
-          <w:lang w:val="en-GB"/>
-        </w:rPr>
-        <w:t>.</w:t>
+        <w:t>Location: Simon 2.61.</w:t>
       </w:r>
     </w:p>
     <w:p>
@@ -1919,7 +1753,6 @@
           <w:shd w:fill="auto" w:val="clear"/>
         </w:rPr>
       </w:pPr>
-      <w:bookmarkStart w:id="4" w:name="_Hlk152949365"/>
       <w:r>
         <w:rPr>
           <w:rFonts w:ascii="Georgia" w:hAnsi="Georgia"/>
@@ -1948,7 +1781,7 @@
         <w:tab/>
         <w:tab/>
         <w:tab/>
-        <w:t xml:space="preserve">Mon </w:t>
+        <w:t xml:space="preserve">Mon 16 Mar, </w:t>
       </w:r>
       <w:r>
         <w:rPr>
@@ -1956,23 +1789,7 @@
           <w:shd w:fill="auto" w:val="clear"/>
           <w:lang w:val="en-GB"/>
         </w:rPr>
-        <w:t>16 Mar</w:t>
-      </w:r>
-      <w:r>
-        <w:rPr>
-          <w:rFonts w:ascii="Georgia" w:hAnsi="Georgia"/>
-          <w:shd w:fill="auto" w:val="clear"/>
-          <w:lang w:val="en-GB"/>
-        </w:rPr>
-        <w:t xml:space="preserve">, </w:t>
-      </w:r>
-      <w:r>
-        <w:rPr>
-          <w:rFonts w:ascii="Georgia" w:hAnsi="Georgia"/>
-          <w:shd w:fill="auto" w:val="clear"/>
-          <w:lang w:val="en-GB"/>
-        </w:rPr>
-        <w:t>6</w:t>
+        <w:t>2</w:t>
       </w:r>
       <w:r>
         <w:rPr>
@@ -2001,6 +1818,7 @@
         <w:t>Submission deadline:</w:t>
         <w:tab/>
         <w:tab/>
+        <w:t xml:space="preserve">Mon 30 Mar, </w:t>
       </w:r>
       <w:r>
         <w:rPr>
@@ -2008,7 +1826,15 @@
           <w:shd w:fill="auto" w:val="clear"/>
           <w:lang w:val="en-GB"/>
         </w:rPr>
-        <w:t>Mon 30 Mar, 6pm</w:t>
+        <w:t>2</w:t>
+      </w:r>
+      <w:r>
+        <w:rPr>
+          <w:rFonts w:ascii="Georgia" w:hAnsi="Georgia"/>
+          <w:shd w:fill="auto" w:val="clear"/>
+          <w:lang w:val="en-GB"/>
+        </w:rPr>
+        <w:t>pm</w:t>
       </w:r>
     </w:p>
     <w:p>
@@ -2073,6 +1899,7 @@
         <w:tab/>
         <w:tab/>
         <w:tab/>
+        <w:t xml:space="preserve">Mon 13 Apr, </w:t>
       </w:r>
       <w:r>
         <w:rPr>
@@ -2080,7 +1907,7 @@
           <w:shd w:fill="auto" w:val="clear"/>
           <w:lang w:val="en-GB"/>
         </w:rPr>
-        <w:t xml:space="preserve">Mon </w:t>
+        <w:t>2</w:t>
       </w:r>
       <w:r>
         <w:rPr>
@@ -2088,31 +1915,7 @@
           <w:shd w:fill="auto" w:val="clear"/>
           <w:lang w:val="en-GB"/>
         </w:rPr>
-        <w:t>13</w:t>
-      </w:r>
-      <w:r>
-        <w:rPr>
-          <w:rFonts w:ascii="Georgia" w:hAnsi="Georgia"/>
-          <w:shd w:fill="auto" w:val="clear"/>
-          <w:lang w:val="en-GB"/>
-        </w:rPr>
-        <w:t xml:space="preserve"> </w:t>
-      </w:r>
-      <w:r>
-        <w:rPr>
-          <w:rFonts w:ascii="Georgia" w:hAnsi="Georgia"/>
-          <w:shd w:fill="auto" w:val="clear"/>
-          <w:lang w:val="en-GB"/>
-        </w:rPr>
-        <w:t>Apr</w:t>
-      </w:r>
-      <w:r>
-        <w:rPr>
-          <w:rFonts w:ascii="Georgia" w:hAnsi="Georgia"/>
-          <w:shd w:fill="auto" w:val="clear"/>
-          <w:lang w:val="en-GB"/>
-        </w:rPr>
-        <w:t>, 6pm</w:t>
+        <w:t>pm</w:t>
       </w:r>
     </w:p>
     <w:p>
@@ -2124,7 +1927,7 @@
           <w:shd w:fill="auto" w:val="clear"/>
         </w:rPr>
       </w:pPr>
-      <w:bookmarkStart w:id="5" w:name="_Hlk152949365"/>
+      <w:bookmarkStart w:id="4" w:name="_Hlk152949365"/>
       <w:r>
         <w:rPr>
           <w:rFonts w:ascii="Georgia" w:hAnsi="Georgia"/>
@@ -2134,7 +1937,7 @@
         <w:t>Submission deadline:</w:t>
         <w:tab/>
       </w:r>
-      <w:bookmarkEnd w:id="5"/>
+      <w:bookmarkEnd w:id="4"/>
       <w:r>
         <w:rPr>
           <w:rFonts w:ascii="Georgia" w:hAnsi="Georgia"/>
@@ -2142,6 +1945,7 @@
           <w:lang w:val="en-GB"/>
         </w:rPr>
         <w:tab/>
+        <w:t xml:space="preserve">Mon 27 Apr, </w:t>
       </w:r>
       <w:r>
         <w:rPr>
@@ -2149,7 +1953,15 @@
           <w:shd w:fill="auto" w:val="clear"/>
           <w:lang w:val="en-GB"/>
         </w:rPr>
-        <w:t>Mon 27 Apr, 6pm</w:t>
+        <w:t>2</w:t>
+      </w:r>
+      <w:r>
+        <w:rPr>
+          <w:rFonts w:ascii="Georgia" w:hAnsi="Georgia"/>
+          <w:shd w:fill="auto" w:val="clear"/>
+          <w:lang w:val="en-GB"/>
+        </w:rPr>
+        <w:t>pm</w:t>
       </w:r>
     </w:p>
     <w:p>
@@ -2226,6 +2038,7 @@
         <w:tab/>
         <w:tab/>
         <w:tab/>
+        <w:t xml:space="preserve">Mon, 11 May, </w:t>
       </w:r>
       <w:r>
         <w:rPr>
@@ -2233,7 +2046,15 @@
           <w:shd w:fill="auto" w:val="clear"/>
           <w:lang w:val="en-GB"/>
         </w:rPr>
-        <w:t>Mon, 11 May, 6pm</w:t>
+        <w:t>2</w:t>
+      </w:r>
+      <w:r>
+        <w:rPr>
+          <w:rFonts w:ascii="Georgia" w:hAnsi="Georgia"/>
+          <w:shd w:fill="auto" w:val="clear"/>
+          <w:lang w:val="en-GB"/>
+        </w:rPr>
+        <w:t>pm</w:t>
       </w:r>
     </w:p>
     <w:p>
@@ -2255,6 +2076,7 @@
         <w:t xml:space="preserve">Submission deadline: </w:t>
         <w:tab/>
         <w:tab/>
+        <w:t xml:space="preserve">Mon, 8 Jun, </w:t>
       </w:r>
       <w:r>
         <w:rPr>
@@ -2262,7 +2084,7 @@
           <w:shd w:fill="auto" w:val="clear"/>
           <w:lang w:val="en-GB"/>
         </w:rPr>
-        <w:t xml:space="preserve">Mon, </w:t>
+        <w:t>2</w:t>
       </w:r>
       <w:r>
         <w:rPr>
@@ -2270,15 +2092,7 @@
           <w:shd w:fill="auto" w:val="clear"/>
           <w:lang w:val="en-GB"/>
         </w:rPr>
-        <w:t>8</w:t>
-      </w:r>
-      <w:r>
-        <w:rPr>
-          <w:rFonts w:ascii="Georgia" w:hAnsi="Georgia"/>
-          <w:shd w:fill="auto" w:val="clear"/>
-          <w:lang w:val="en-GB"/>
-        </w:rPr>
-        <w:t xml:space="preserve"> Jun, 6pm</w:t>
+        <w:t>pm</w:t>
       </w:r>
     </w:p>
     <w:p>
@@ -3025,19 +2839,19 @@
           <w:lang w:val="en-GB"/>
         </w:rPr>
       </w:pPr>
-      <w:bookmarkStart w:id="6" w:name="__RefHeading___Toc5928_3067524283"/>
-      <w:bookmarkStart w:id="7" w:name="_Toc219548393"/>
-      <w:bookmarkStart w:id="8" w:name="Course_Content"/>
+      <w:bookmarkStart w:id="5" w:name="__RefHeading___Toc5928_3067524283"/>
+      <w:bookmarkStart w:id="6" w:name="_Toc219548393"/>
+      <w:bookmarkStart w:id="7" w:name="Course_Content"/>
+      <w:bookmarkEnd w:id="5"/>
+      <w:bookmarkEnd w:id="7"/>
+      <w:r>
+        <w:rPr>
+          <w:rFonts w:ascii="Georgia" w:hAnsi="Georgia"/>
+          <w:lang w:val="en-GB"/>
+        </w:rPr>
+        <w:t>Course Content</w:t>
+      </w:r>
       <w:bookmarkEnd w:id="6"/>
-      <w:bookmarkEnd w:id="8"/>
-      <w:r>
-        <w:rPr>
-          <w:rFonts w:ascii="Georgia" w:hAnsi="Georgia"/>
-          <w:lang w:val="en-GB"/>
-        </w:rPr>
-        <w:t>Course Content</w:t>
-      </w:r>
-      <w:bookmarkEnd w:id="7"/>
     </w:p>
     <w:p>
       <w:pPr>
@@ -3052,19 +2866,19 @@
           <w:lang w:val="en-GB"/>
         </w:rPr>
       </w:pPr>
-      <w:bookmarkStart w:id="9" w:name="__RefHeading___Toc5930_3067524283"/>
-      <w:bookmarkStart w:id="10" w:name="_Toc219548394"/>
-      <w:bookmarkStart w:id="11" w:name="Course_Aims"/>
+      <w:bookmarkStart w:id="8" w:name="__RefHeading___Toc5930_3067524283"/>
+      <w:bookmarkStart w:id="9" w:name="_Toc219548394"/>
+      <w:bookmarkStart w:id="10" w:name="Course_Aims"/>
+      <w:bookmarkEnd w:id="8"/>
+      <w:bookmarkEnd w:id="10"/>
+      <w:r>
+        <w:rPr>
+          <w:rFonts w:ascii="Georgia" w:hAnsi="Georgia"/>
+          <w:lang w:val="en-GB"/>
+        </w:rPr>
+        <w:t>Aims</w:t>
+      </w:r>
       <w:bookmarkEnd w:id="9"/>
-      <w:bookmarkEnd w:id="11"/>
-      <w:r>
-        <w:rPr>
-          <w:rFonts w:ascii="Georgia" w:hAnsi="Georgia"/>
-          <w:lang w:val="en-GB"/>
-        </w:rPr>
-        <w:t>Aims</w:t>
-      </w:r>
-      <w:bookmarkEnd w:id="10"/>
     </w:p>
     <w:p>
       <w:pPr>
@@ -3159,34 +2973,34 @@
           <w:lang w:val="en-GB"/>
         </w:rPr>
       </w:pPr>
-      <w:bookmarkStart w:id="12" w:name="__RefHeading___Toc5932_3067524283"/>
+      <w:bookmarkStart w:id="11" w:name="__RefHeading___Toc5932_3067524283"/>
+      <w:bookmarkStart w:id="12" w:name="_Toc219548395"/>
       <w:bookmarkStart w:id="13" w:name="Learning_Outcomes"/>
-      <w:bookmarkStart w:id="14" w:name="_Toc219548395"/>
+      <w:bookmarkEnd w:id="11"/>
+      <w:bookmarkEnd w:id="13"/>
+      <w:r>
+        <w:rPr>
+          <w:rFonts w:ascii="Georgia" w:hAnsi="Georgia"/>
+          <w:lang w:val="en-GB"/>
+        </w:rPr>
+        <w:t>Learning</w:t>
+      </w:r>
+      <w:r>
+        <w:rPr>
+          <w:rFonts w:ascii="Georgia" w:hAnsi="Georgia"/>
+          <w:spacing w:val="8"/>
+          <w:lang w:val="en-GB"/>
+        </w:rPr>
+        <w:t xml:space="preserve"> </w:t>
+      </w:r>
+      <w:r>
+        <w:rPr>
+          <w:rFonts w:ascii="Georgia" w:hAnsi="Georgia"/>
+          <w:lang w:val="en-GB"/>
+        </w:rPr>
+        <w:t>Outcomes</w:t>
+      </w:r>
       <w:bookmarkEnd w:id="12"/>
-      <w:bookmarkEnd w:id="13"/>
-      <w:r>
-        <w:rPr>
-          <w:rFonts w:ascii="Georgia" w:hAnsi="Georgia"/>
-          <w:lang w:val="en-GB"/>
-        </w:rPr>
-        <w:t>Learning</w:t>
-      </w:r>
-      <w:r>
-        <w:rPr>
-          <w:rFonts w:ascii="Georgia" w:hAnsi="Georgia"/>
-          <w:spacing w:val="8"/>
-          <w:lang w:val="en-GB"/>
-        </w:rPr>
-        <w:t xml:space="preserve"> </w:t>
-      </w:r>
-      <w:r>
-        <w:rPr>
-          <w:rFonts w:ascii="Georgia" w:hAnsi="Georgia"/>
-          <w:lang w:val="en-GB"/>
-        </w:rPr>
-        <w:t>Outcomes</w:t>
-      </w:r>
-      <w:bookmarkEnd w:id="14"/>
     </w:p>
     <w:p>
       <w:pPr>
@@ -3510,21 +3324,7 @@
           <w:rFonts w:ascii="Georgia" w:hAnsi="Georgia"/>
           <w:lang w:val="en-GB"/>
         </w:rPr>
-        <w:t>Choose appropriate techniques for network data visuali</w:t>
-      </w:r>
-      <w:r>
-        <w:rPr>
-          <w:rFonts w:ascii="Georgia" w:hAnsi="Georgia"/>
-          <w:lang w:val="en-GB"/>
-        </w:rPr>
-        <w:t>s</w:t>
-      </w:r>
-      <w:r>
-        <w:rPr>
-          <w:rFonts w:ascii="Georgia" w:hAnsi="Georgia"/>
-          <w:lang w:val="en-GB"/>
-        </w:rPr>
-        <w:t>ation.</w:t>
+        <w:t>Choose appropriate techniques for network data visualisation.</w:t>
       </w:r>
     </w:p>
     <w:p>
@@ -3648,21 +3448,7 @@
           <w:rFonts w:eastAsia="Palatino Linotype" w:cs="Palatino Linotype" w:ascii="Georgia" w:hAnsi="Georgia"/>
           <w:lang w:val="en-GB"/>
         </w:rPr>
-        <w:t>Produce state-of-the-art network data visuali</w:t>
-      </w:r>
-      <w:r>
-        <w:rPr>
-          <w:rFonts w:eastAsia="Palatino Linotype" w:cs="Palatino Linotype" w:ascii="Georgia" w:hAnsi="Georgia"/>
-          <w:lang w:val="en-GB"/>
-        </w:rPr>
-        <w:t>s</w:t>
-      </w:r>
-      <w:r>
-        <w:rPr>
-          <w:rFonts w:eastAsia="Palatino Linotype" w:cs="Palatino Linotype" w:ascii="Georgia" w:hAnsi="Georgia"/>
-          <w:lang w:val="en-GB"/>
-        </w:rPr>
-        <w:t>ations.</w:t>
+        <w:t>Produce state-of-the-art network data visualisations.</w:t>
       </w:r>
     </w:p>
     <w:p>
@@ -3811,8 +3597,8 @@
         </w:rPr>
         <w:t>Accurately and effectively work with numbers and use advanced computational software for network analysis.</w:t>
       </w:r>
-      <w:bookmarkStart w:id="15" w:name="General_Course_Readings"/>
-      <w:bookmarkEnd w:id="15"/>
+      <w:bookmarkStart w:id="14" w:name="General_Course_Readings"/>
+      <w:bookmarkEnd w:id="14"/>
     </w:p>
     <w:p>
       <w:pPr>
@@ -3826,47 +3612,47 @@
           <w:lang w:val="en-GB"/>
         </w:rPr>
       </w:pPr>
-      <w:bookmarkStart w:id="16" w:name="__RefHeading___Toc5934_3067524283"/>
-      <w:bookmarkStart w:id="17" w:name="_Toc219548396"/>
+      <w:bookmarkStart w:id="15" w:name="__RefHeading___Toc5934_3067524283"/>
+      <w:bookmarkStart w:id="16" w:name="_Toc219548396"/>
+      <w:bookmarkEnd w:id="15"/>
+      <w:r>
+        <w:rPr>
+          <w:rFonts w:ascii="Georgia" w:hAnsi="Georgia"/>
+          <w:lang w:val="en-GB"/>
+        </w:rPr>
+        <w:t>General</w:t>
+      </w:r>
+      <w:r>
+        <w:rPr>
+          <w:rFonts w:ascii="Georgia" w:hAnsi="Georgia"/>
+          <w:spacing w:val="52"/>
+          <w:lang w:val="en-GB"/>
+        </w:rPr>
+        <w:t xml:space="preserve"> </w:t>
+      </w:r>
+      <w:r>
+        <w:rPr>
+          <w:rFonts w:ascii="Georgia" w:hAnsi="Georgia"/>
+          <w:lang w:val="en-GB"/>
+        </w:rPr>
+        <w:t>Course</w:t>
+      </w:r>
+      <w:r>
+        <w:rPr>
+          <w:rFonts w:ascii="Georgia" w:hAnsi="Georgia"/>
+          <w:spacing w:val="53"/>
+          <w:lang w:val="en-GB"/>
+        </w:rPr>
+        <w:t xml:space="preserve"> </w:t>
+      </w:r>
+      <w:r>
+        <w:rPr>
+          <w:rFonts w:ascii="Georgia" w:hAnsi="Georgia"/>
+          <w:lang w:val="en-GB"/>
+        </w:rPr>
+        <w:t>Readings</w:t>
+      </w:r>
       <w:bookmarkEnd w:id="16"/>
-      <w:r>
-        <w:rPr>
-          <w:rFonts w:ascii="Georgia" w:hAnsi="Georgia"/>
-          <w:lang w:val="en-GB"/>
-        </w:rPr>
-        <w:t>General</w:t>
-      </w:r>
-      <w:r>
-        <w:rPr>
-          <w:rFonts w:ascii="Georgia" w:hAnsi="Georgia"/>
-          <w:spacing w:val="52"/>
-          <w:lang w:val="en-GB"/>
-        </w:rPr>
-        <w:t xml:space="preserve"> </w:t>
-      </w:r>
-      <w:r>
-        <w:rPr>
-          <w:rFonts w:ascii="Georgia" w:hAnsi="Georgia"/>
-          <w:lang w:val="en-GB"/>
-        </w:rPr>
-        <w:t>Course</w:t>
-      </w:r>
-      <w:r>
-        <w:rPr>
-          <w:rFonts w:ascii="Georgia" w:hAnsi="Georgia"/>
-          <w:spacing w:val="53"/>
-          <w:lang w:val="en-GB"/>
-        </w:rPr>
-        <w:t xml:space="preserve"> </w:t>
-      </w:r>
-      <w:r>
-        <w:rPr>
-          <w:rFonts w:ascii="Georgia" w:hAnsi="Georgia"/>
-          <w:lang w:val="en-GB"/>
-        </w:rPr>
-        <w:t>Readings</w:t>
-      </w:r>
-      <w:bookmarkEnd w:id="17"/>
     </w:p>
     <w:p>
       <w:pPr>
@@ -3905,14 +3691,14 @@
           <w:numId w:val="2"/>
         </w:numPr>
         <w:rPr>
-          <w:rFonts w:asciiTheme="majorHAnsi" w:hAnsiTheme="majorHAnsi"/>
+          <w:rFonts w:ascii="Cambria" w:hAnsi="Cambria" w:asciiTheme="majorHAnsi" w:hAnsiTheme="majorHAnsi"/>
           <w:highlight w:val="none"/>
           <w:shd w:fill="auto" w:val="clear"/>
         </w:rPr>
       </w:pPr>
       <w:r>
         <w:rPr>
-          <w:rFonts w:asciiTheme="majorHAnsi" w:hAnsiTheme="majorHAnsi" w:ascii="Georgia" w:hAnsi="Georgia"/>
+          <w:rFonts w:asciiTheme="majorHAnsi" w:hAnsiTheme="majorHAnsi"/>
           <w:shd w:fill="auto" w:val="clear"/>
           <w:lang w:val="en-GB"/>
         </w:rPr>
@@ -3920,7 +3706,7 @@
       </w:r>
       <w:r>
         <w:rPr>
-          <w:rFonts w:asciiTheme="majorHAnsi" w:hAnsiTheme="majorHAnsi" w:ascii="Georgia" w:hAnsi="Georgia"/>
+          <w:rFonts w:asciiTheme="majorHAnsi" w:hAnsiTheme="majorHAnsi"/>
           <w:i/>
           <w:iCs/>
           <w:shd w:fill="auto" w:val="clear"/>
@@ -3930,7 +3716,7 @@
       </w:r>
       <w:r>
         <w:rPr>
-          <w:rFonts w:asciiTheme="majorHAnsi" w:hAnsiTheme="majorHAnsi" w:ascii="Georgia" w:hAnsi="Georgia"/>
+          <w:rFonts w:asciiTheme="majorHAnsi" w:hAnsiTheme="majorHAnsi"/>
           <w:shd w:fill="auto" w:val="clear"/>
           <w:lang w:val="en-GB"/>
         </w:rPr>
@@ -3945,14 +3731,14 @@
           <w:numId w:val="2"/>
         </w:numPr>
         <w:rPr>
-          <w:rFonts w:asciiTheme="majorHAnsi" w:hAnsiTheme="majorHAnsi"/>
+          <w:rFonts w:ascii="Cambria" w:hAnsi="Cambria" w:asciiTheme="majorHAnsi" w:hAnsiTheme="majorHAnsi"/>
           <w:highlight w:val="none"/>
           <w:shd w:fill="auto" w:val="clear"/>
         </w:rPr>
       </w:pPr>
       <w:r>
         <w:rPr>
-          <w:rFonts w:asciiTheme="majorHAnsi" w:hAnsiTheme="majorHAnsi" w:ascii="Georgia" w:hAnsi="Georgia"/>
+          <w:rFonts w:asciiTheme="majorHAnsi" w:hAnsiTheme="majorHAnsi"/>
           <w:shd w:fill="auto" w:val="clear"/>
           <w:lang w:val="en-GB"/>
         </w:rPr>
@@ -3960,7 +3746,7 @@
       </w:r>
       <w:r>
         <w:rPr>
-          <w:rFonts w:asciiTheme="majorHAnsi" w:hAnsiTheme="majorHAnsi" w:ascii="Georgia" w:hAnsi="Georgia"/>
+          <w:rFonts w:asciiTheme="majorHAnsi" w:hAnsiTheme="majorHAnsi"/>
           <w:i/>
           <w:iCs/>
           <w:shd w:fill="auto" w:val="clear"/>
@@ -3970,7 +3756,7 @@
       </w:r>
       <w:r>
         <w:rPr>
-          <w:rFonts w:asciiTheme="majorHAnsi" w:hAnsiTheme="majorHAnsi" w:ascii="Georgia" w:hAnsi="Georgia"/>
+          <w:rFonts w:asciiTheme="majorHAnsi" w:hAnsiTheme="majorHAnsi"/>
           <w:shd w:fill="auto" w:val="clear"/>
           <w:lang w:val="en-GB"/>
         </w:rPr>
@@ -3985,14 +3771,14 @@
           <w:numId w:val="2"/>
         </w:numPr>
         <w:rPr>
-          <w:rFonts w:asciiTheme="majorHAnsi" w:hAnsiTheme="majorHAnsi"/>
+          <w:rFonts w:ascii="Cambria" w:hAnsi="Cambria" w:asciiTheme="majorHAnsi" w:hAnsiTheme="majorHAnsi"/>
           <w:highlight w:val="none"/>
           <w:shd w:fill="auto" w:val="clear"/>
         </w:rPr>
       </w:pPr>
       <w:r>
         <w:rPr>
-          <w:rFonts w:asciiTheme="majorHAnsi" w:hAnsiTheme="majorHAnsi" w:ascii="Georgia" w:hAnsi="Georgia"/>
+          <w:rFonts w:asciiTheme="majorHAnsi" w:hAnsiTheme="majorHAnsi"/>
           <w:shd w:fill="auto" w:val="clear"/>
           <w:lang w:val="en-GB"/>
         </w:rPr>
@@ -4000,7 +3786,7 @@
       </w:r>
       <w:r>
         <w:rPr>
-          <w:rFonts w:asciiTheme="majorHAnsi" w:hAnsiTheme="majorHAnsi" w:ascii="Georgia" w:hAnsi="Georgia"/>
+          <w:rFonts w:asciiTheme="majorHAnsi" w:hAnsiTheme="majorHAnsi"/>
           <w:i/>
           <w:iCs/>
           <w:shd w:fill="auto" w:val="clear"/>
@@ -4010,7 +3796,7 @@
       </w:r>
       <w:r>
         <w:rPr>
-          <w:rFonts w:asciiTheme="majorHAnsi" w:hAnsiTheme="majorHAnsi" w:ascii="Georgia" w:hAnsi="Georgia"/>
+          <w:rFonts w:asciiTheme="majorHAnsi" w:hAnsiTheme="majorHAnsi"/>
           <w:shd w:fill="auto" w:val="clear"/>
           <w:lang w:val="en-GB"/>
         </w:rPr>
@@ -4024,9 +3810,9 @@
           <w:ilvl w:val="0"/>
           <w:numId w:val="0"/>
         </w:numPr>
-        <w:ind w:left="120"/>
-        <w:rPr>
-          <w:rFonts w:asciiTheme="majorHAnsi" w:hAnsiTheme="majorHAnsi"/>
+        <w:ind w:hanging="0" w:left="120"/>
+        <w:rPr>
+          <w:rFonts w:ascii="Cambria" w:hAnsi="Cambria" w:asciiTheme="majorHAnsi" w:hAnsiTheme="majorHAnsi"/>
           <w:b/>
           <w:bCs/>
           <w:highlight w:val="none"/>
@@ -4035,7 +3821,7 @@
       </w:pPr>
       <w:r>
         <w:rPr>
-          <w:rFonts w:asciiTheme="majorHAnsi" w:hAnsiTheme="majorHAnsi" w:ascii="Georgia" w:hAnsi="Georgia"/>
+          <w:rFonts w:asciiTheme="majorHAnsi" w:hAnsiTheme="majorHAnsi"/>
           <w:b/>
           <w:bCs/>
           <w:shd w:fill="auto" w:val="clear"/>
@@ -4056,32 +3842,32 @@
           <w:lang w:val="en-GB"/>
         </w:rPr>
       </w:pPr>
-      <w:bookmarkStart w:id="18" w:name="__RefHeading___Toc5936_3067524283"/>
-      <w:bookmarkStart w:id="19" w:name="_Toc219548397"/>
+      <w:bookmarkStart w:id="17" w:name="__RefHeading___Toc5936_3067524283"/>
+      <w:bookmarkStart w:id="18" w:name="_Toc219548397"/>
+      <w:bookmarkEnd w:id="17"/>
+      <w:r>
+        <w:rPr>
+          <w:rFonts w:ascii="Georgia" w:hAnsi="Georgia"/>
+          <w:lang w:val="en-GB"/>
+        </w:rPr>
+        <w:t>Course</w:t>
+      </w:r>
+      <w:r>
+        <w:rPr>
+          <w:rFonts w:ascii="Georgia" w:hAnsi="Georgia"/>
+          <w:spacing w:val="64"/>
+          <w:lang w:val="en-GB"/>
+        </w:rPr>
+        <w:t xml:space="preserve"> </w:t>
+      </w:r>
+      <w:r>
+        <w:rPr>
+          <w:rFonts w:ascii="Georgia" w:hAnsi="Georgia"/>
+          <w:lang w:val="en-GB"/>
+        </w:rPr>
+        <w:t>Plan</w:t>
+      </w:r>
       <w:bookmarkEnd w:id="18"/>
-      <w:r>
-        <w:rPr>
-          <w:rFonts w:ascii="Georgia" w:hAnsi="Georgia"/>
-          <w:lang w:val="en-GB"/>
-        </w:rPr>
-        <w:t>Course</w:t>
-      </w:r>
-      <w:r>
-        <w:rPr>
-          <w:rFonts w:ascii="Georgia" w:hAnsi="Georgia"/>
-          <w:spacing w:val="64"/>
-          <w:lang w:val="en-GB"/>
-        </w:rPr>
-        <w:t xml:space="preserve"> </w:t>
-      </w:r>
-      <w:r>
-        <w:rPr>
-          <w:rFonts w:ascii="Georgia" w:hAnsi="Georgia"/>
-          <w:lang w:val="en-GB"/>
-        </w:rPr>
-        <w:t>Plan</w:t>
-      </w:r>
-      <w:bookmarkEnd w:id="19"/>
     </w:p>
     <w:p>
       <w:pPr>
@@ -4663,25 +4449,7 @@
                 <w:shd w:fill="auto" w:val="clear"/>
                 <w:lang w:val="en-GB"/>
               </w:rPr>
-              <w:t xml:space="preserve">Network data entry and manipulation in R. Computing descriptive measures and visualising networks </w:t>
-            </w:r>
-            <w:r>
-              <w:rPr>
-                <w:rFonts w:ascii="Georgia" w:hAnsi="Georgia"/>
-                <w:sz w:val="20"/>
-                <w:shd w:fill="auto" w:val="clear"/>
-                <w:lang w:val="en-GB"/>
-              </w:rPr>
-              <w:t>using statnet, igraph, tidygraph, and ggraph</w:t>
-            </w:r>
-            <w:r>
-              <w:rPr>
-                <w:rFonts w:ascii="Georgia" w:hAnsi="Georgia"/>
-                <w:sz w:val="20"/>
-                <w:shd w:fill="auto" w:val="clear"/>
-                <w:lang w:val="en-GB"/>
-              </w:rPr>
-              <w:t>.</w:t>
+              <w:t>Network data entry and manipulation in R. Computing descriptive measures and visualising networks using statnet, igraph, tidygraph, and ggraph.</w:t>
             </w:r>
           </w:p>
         </w:tc>
@@ -4768,25 +4536,7 @@
                 <w:shd w:fill="auto" w:val="clear"/>
                 <w:lang w:val="en-GB"/>
               </w:rPr>
-              <w:t xml:space="preserve">Estimating exponential random graph models (ERGM) in R and selecting model terms </w:t>
-            </w:r>
-            <w:r>
-              <w:rPr>
-                <w:rFonts w:ascii="Georgia" w:hAnsi="Georgia"/>
-                <w:sz w:val="20"/>
-                <w:shd w:fill="auto" w:val="clear"/>
-                <w:lang w:val="en-GB"/>
-              </w:rPr>
-              <w:t>using the ergm package</w:t>
-            </w:r>
-            <w:r>
-              <w:rPr>
-                <w:rFonts w:ascii="Georgia" w:hAnsi="Georgia"/>
-                <w:sz w:val="20"/>
-                <w:shd w:fill="auto" w:val="clear"/>
-                <w:lang w:val="en-GB"/>
-              </w:rPr>
-              <w:t>.</w:t>
+              <w:t>Estimating exponential random graph models (ERGM) in R and selecting model terms using the ergm package.</w:t>
             </w:r>
           </w:p>
         </w:tc>
@@ -5172,21 +4922,21 @@
           <w:lang w:val="en-GB"/>
         </w:rPr>
       </w:pPr>
-      <w:bookmarkStart w:id="20" w:name="__RefHeading___Toc5938_3067524283"/>
-      <w:bookmarkStart w:id="21" w:name="_Toc219548398"/>
-      <w:bookmarkStart w:id="22" w:name="Assessments"/>
+      <w:bookmarkStart w:id="19" w:name="__RefHeading___Toc5938_3067524283"/>
+      <w:bookmarkStart w:id="20" w:name="_Toc219548398"/>
+      <w:bookmarkStart w:id="21" w:name="Assessments"/>
+      <w:bookmarkEnd w:id="19"/>
+      <w:bookmarkEnd w:id="21"/>
+      <w:r>
+        <w:rPr>
+          <w:rFonts w:ascii="Georgia" w:hAnsi="Georgia"/>
+          <w:lang w:val="en-GB"/>
+        </w:rPr>
+        <w:t>Assessment</w:t>
+      </w:r>
+      <w:bookmarkStart w:id="22" w:name="Formative_Assessment"/>
       <w:bookmarkEnd w:id="20"/>
       <w:bookmarkEnd w:id="22"/>
-      <w:r>
-        <w:rPr>
-          <w:rFonts w:ascii="Georgia" w:hAnsi="Georgia"/>
-          <w:lang w:val="en-GB"/>
-        </w:rPr>
-        <w:t>Assessment</w:t>
-      </w:r>
-      <w:bookmarkStart w:id="23" w:name="Formative_Assessment"/>
-      <w:bookmarkEnd w:id="21"/>
-      <w:bookmarkEnd w:id="23"/>
     </w:p>
     <w:p>
       <w:pPr>
@@ -5199,8 +4949,8 @@
           <w:lang w:val="en-GB"/>
         </w:rPr>
       </w:pPr>
-      <w:bookmarkStart w:id="24" w:name="Summative_Assessment"/>
-      <w:bookmarkEnd w:id="24"/>
+      <w:bookmarkStart w:id="23" w:name="Summative_Assessment"/>
+      <w:bookmarkEnd w:id="23"/>
       <w:r>
         <w:rPr>
           <w:rFonts w:ascii="Georgia" w:hAnsi="Georgia"/>
@@ -5371,17 +5121,17 @@
           <w:lang w:val="en-GB"/>
         </w:rPr>
       </w:pPr>
-      <w:bookmarkStart w:id="25" w:name="__RefHeading___Toc5940_3067524283"/>
-      <w:bookmarkStart w:id="26" w:name="_Toc219548399"/>
+      <w:bookmarkStart w:id="24" w:name="__RefHeading___Toc5940_3067524283"/>
+      <w:bookmarkStart w:id="25" w:name="_Toc219548399"/>
+      <w:bookmarkEnd w:id="24"/>
+      <w:r>
+        <w:rPr>
+          <w:rFonts w:ascii="Georgia" w:hAnsi="Georgia"/>
+          <w:lang w:val="en-GB"/>
+        </w:rPr>
+        <w:t>Formative Assessment</w:t>
+      </w:r>
       <w:bookmarkEnd w:id="25"/>
-      <w:r>
-        <w:rPr>
-          <w:rFonts w:ascii="Georgia" w:hAnsi="Georgia"/>
-          <w:lang w:val="en-GB"/>
-        </w:rPr>
-        <w:t>Formative Assessment</w:t>
-      </w:r>
-      <w:bookmarkEnd w:id="26"/>
     </w:p>
     <w:p>
       <w:pPr>
@@ -5529,32 +5279,32 @@
           <w:lang w:val="en-GB"/>
         </w:rPr>
       </w:pPr>
-      <w:bookmarkStart w:id="27" w:name="__RefHeading___Toc5942_3067524283"/>
-      <w:bookmarkStart w:id="28" w:name="_Toc219548400"/>
+      <w:bookmarkStart w:id="26" w:name="__RefHeading___Toc5942_3067524283"/>
+      <w:bookmarkStart w:id="27" w:name="_Toc219548400"/>
+      <w:bookmarkEnd w:id="26"/>
+      <w:r>
+        <w:rPr>
+          <w:rFonts w:ascii="Georgia" w:hAnsi="Georgia"/>
+          <w:lang w:val="en-GB"/>
+        </w:rPr>
+        <w:t>Summative</w:t>
+      </w:r>
+      <w:r>
+        <w:rPr>
+          <w:rFonts w:ascii="Georgia" w:hAnsi="Georgia"/>
+          <w:spacing w:val="-8"/>
+          <w:lang w:val="en-GB"/>
+        </w:rPr>
+        <w:t xml:space="preserve"> </w:t>
+      </w:r>
+      <w:r>
+        <w:rPr>
+          <w:rFonts w:ascii="Georgia" w:hAnsi="Georgia"/>
+          <w:lang w:val="en-GB"/>
+        </w:rPr>
+        <w:t>Assessment</w:t>
+      </w:r>
       <w:bookmarkEnd w:id="27"/>
-      <w:r>
-        <w:rPr>
-          <w:rFonts w:ascii="Georgia" w:hAnsi="Georgia"/>
-          <w:lang w:val="en-GB"/>
-        </w:rPr>
-        <w:t>Summative</w:t>
-      </w:r>
-      <w:r>
-        <w:rPr>
-          <w:rFonts w:ascii="Georgia" w:hAnsi="Georgia"/>
-          <w:spacing w:val="-8"/>
-          <w:lang w:val="en-GB"/>
-        </w:rPr>
-        <w:t xml:space="preserve"> </w:t>
-      </w:r>
-      <w:r>
-        <w:rPr>
-          <w:rFonts w:ascii="Georgia" w:hAnsi="Georgia"/>
-          <w:lang w:val="en-GB"/>
-        </w:rPr>
-        <w:t>Assessment</w:t>
-      </w:r>
-      <w:bookmarkEnd w:id="28"/>
     </w:p>
     <w:p>
       <w:pPr>
@@ -5679,23 +5429,7 @@
           <w:shd w:fill="auto" w:val="clear"/>
           <w:lang w:val="en-GB"/>
         </w:rPr>
-        <w:t xml:space="preserve">descriptive </w:t>
-      </w:r>
-      <w:r>
-        <w:rPr>
-          <w:rFonts w:ascii="Georgia" w:hAnsi="Georgia"/>
-          <w:shd w:fill="auto" w:val="clear"/>
-          <w:lang w:val="en-GB"/>
-        </w:rPr>
-        <w:t xml:space="preserve">network </w:t>
-      </w:r>
-      <w:r>
-        <w:rPr>
-          <w:rFonts w:ascii="Georgia" w:hAnsi="Georgia"/>
-          <w:shd w:fill="auto" w:val="clear"/>
-          <w:lang w:val="en-GB"/>
-        </w:rPr>
-        <w:t>statistics</w:t>
+        <w:t>descriptive network statistics</w:t>
       </w:r>
     </w:p>
     <w:p>
@@ -5735,8 +5469,8 @@
           <w:shd w:fill="auto" w:val="clear"/>
         </w:rPr>
       </w:pPr>
-      <w:bookmarkStart w:id="29" w:name="Submission_of_Assessments"/>
-      <w:bookmarkEnd w:id="29"/>
+      <w:bookmarkStart w:id="28" w:name="Submission_of_Assessments"/>
+      <w:bookmarkEnd w:id="28"/>
       <w:r>
         <w:rPr>
           <w:rFonts w:ascii="Georgia" w:hAnsi="Georgia"/>
@@ -5870,47 +5604,47 @@
           <w:lang w:val="en-GB"/>
         </w:rPr>
       </w:pPr>
-      <w:bookmarkStart w:id="30" w:name="__RefHeading___Toc5944_3067524283"/>
-      <w:bookmarkStart w:id="31" w:name="_Toc219548401"/>
+      <w:bookmarkStart w:id="29" w:name="__RefHeading___Toc5944_3067524283"/>
+      <w:bookmarkStart w:id="30" w:name="_Toc219548401"/>
+      <w:bookmarkEnd w:id="29"/>
+      <w:r>
+        <w:rPr>
+          <w:rFonts w:ascii="Georgia" w:hAnsi="Georgia"/>
+          <w:lang w:val="en-GB"/>
+        </w:rPr>
+        <w:t>Submission</w:t>
+      </w:r>
+      <w:r>
+        <w:rPr>
+          <w:rFonts w:ascii="Georgia" w:hAnsi="Georgia"/>
+          <w:spacing w:val="3"/>
+          <w:lang w:val="en-GB"/>
+        </w:rPr>
+        <w:t xml:space="preserve"> </w:t>
+      </w:r>
+      <w:r>
+        <w:rPr>
+          <w:rFonts w:ascii="Georgia" w:hAnsi="Georgia"/>
+          <w:lang w:val="en-GB"/>
+        </w:rPr>
+        <w:t>of</w:t>
+      </w:r>
+      <w:r>
+        <w:rPr>
+          <w:rFonts w:ascii="Georgia" w:hAnsi="Georgia"/>
+          <w:spacing w:val="4"/>
+          <w:lang w:val="en-GB"/>
+        </w:rPr>
+        <w:t xml:space="preserve"> </w:t>
+      </w:r>
+      <w:r>
+        <w:rPr>
+          <w:rFonts w:ascii="Georgia" w:hAnsi="Georgia"/>
+          <w:lang w:val="en-GB"/>
+        </w:rPr>
+        <w:t>Assignments</w:t>
+      </w:r>
       <w:bookmarkEnd w:id="30"/>
-      <w:r>
-        <w:rPr>
-          <w:rFonts w:ascii="Georgia" w:hAnsi="Georgia"/>
-          <w:lang w:val="en-GB"/>
-        </w:rPr>
-        <w:t>Submission</w:t>
-      </w:r>
-      <w:r>
-        <w:rPr>
-          <w:rFonts w:ascii="Georgia" w:hAnsi="Georgia"/>
-          <w:spacing w:val="3"/>
-          <w:lang w:val="en-GB"/>
-        </w:rPr>
-        <w:t xml:space="preserve"> </w:t>
-      </w:r>
-      <w:r>
-        <w:rPr>
-          <w:rFonts w:ascii="Georgia" w:hAnsi="Georgia"/>
-          <w:lang w:val="en-GB"/>
-        </w:rPr>
-        <w:t>of</w:t>
-      </w:r>
-      <w:r>
-        <w:rPr>
-          <w:rFonts w:ascii="Georgia" w:hAnsi="Georgia"/>
-          <w:spacing w:val="4"/>
-          <w:lang w:val="en-GB"/>
-        </w:rPr>
-        <w:t xml:space="preserve"> </w:t>
-      </w:r>
-      <w:r>
-        <w:rPr>
-          <w:rFonts w:ascii="Georgia" w:hAnsi="Georgia"/>
-          <w:lang w:val="en-GB"/>
-        </w:rPr>
-        <w:t>Assignments</w:t>
-      </w:r>
-      <w:bookmarkEnd w:id="31"/>
     </w:p>
     <w:p>
       <w:pPr>
@@ -5976,39 +5710,7 @@
           <w:w w:val="105"/>
           <w:lang w:val="en-GB"/>
         </w:rPr>
-        <w:t xml:space="preserve">You must include an accurate word count on the front page </w:t>
-      </w:r>
-      <w:r>
-        <w:rPr>
-          <w:rFonts w:ascii="Georgia" w:hAnsi="Georgia"/>
-          <w:w w:val="105"/>
-          <w:lang w:val="en-GB"/>
-        </w:rPr>
-        <w:t xml:space="preserve">or at the beginning </w:t>
-      </w:r>
-      <w:r>
-        <w:rPr>
-          <w:rFonts w:ascii="Georgia" w:hAnsi="Georgia"/>
-          <w:w w:val="105"/>
-          <w:lang w:val="en-GB"/>
-        </w:rPr>
-        <w:t xml:space="preserve">of your </w:t>
-      </w:r>
-      <w:r>
-        <w:rPr>
-          <w:rFonts w:ascii="Georgia" w:hAnsi="Georgia"/>
-          <w:w w:val="105"/>
-          <w:lang w:val="en-GB"/>
-        </w:rPr>
-        <w:t>report</w:t>
-      </w:r>
-      <w:r>
-        <w:rPr>
-          <w:rFonts w:ascii="Georgia" w:hAnsi="Georgia"/>
-          <w:w w:val="105"/>
-          <w:lang w:val="en-GB"/>
-        </w:rPr>
-        <w:t>. Failure to do so</w:t>
+        <w:t>You must include an accurate word count on the front page or at the beginning of your report. Failure to do so</w:t>
       </w:r>
       <w:r>
         <w:rPr>
@@ -6025,39 +5727,7 @@
           <w:w w:val="105"/>
           <w:lang w:val="en-GB"/>
         </w:rPr>
-        <w:t xml:space="preserve">will lead to an automatic 2-mark deduction. Your word count </w:t>
-      </w:r>
-      <w:r>
-        <w:rPr>
-          <w:rFonts w:ascii="Georgia" w:hAnsi="Georgia"/>
-          <w:w w:val="105"/>
-          <w:lang w:val="en-GB"/>
-        </w:rPr>
-        <w:t>must</w:t>
-      </w:r>
-      <w:r>
-        <w:rPr>
-          <w:rFonts w:ascii="Georgia" w:hAnsi="Georgia"/>
-          <w:w w:val="105"/>
-          <w:lang w:val="en-GB"/>
-        </w:rPr>
-        <w:t xml:space="preserve"> include all text in </w:t>
-      </w:r>
-      <w:r>
-        <w:rPr>
-          <w:rFonts w:ascii="Georgia" w:hAnsi="Georgia"/>
-          <w:w w:val="105"/>
-          <w:lang w:val="en-GB"/>
-        </w:rPr>
-        <w:t>the report</w:t>
-      </w:r>
-      <w:r>
-        <w:rPr>
-          <w:rFonts w:ascii="Georgia" w:hAnsi="Georgia"/>
-          <w:w w:val="105"/>
-          <w:lang w:val="en-GB"/>
-        </w:rPr>
-        <w:t xml:space="preserve"> but</w:t>
+        <w:t>will lead to an automatic 2-mark deduction. Your word count must include all text in the report but</w:t>
       </w:r>
       <w:r>
         <w:rPr>
@@ -6091,23 +5761,7 @@
           <w:w w:val="105"/>
           <w:lang w:val="en-GB"/>
         </w:rPr>
-        <w:t xml:space="preserve">the bibliography, </w:t>
-      </w:r>
-      <w:r>
-        <w:rPr>
-          <w:rFonts w:ascii="Georgia" w:hAnsi="Georgia"/>
-          <w:w w:val="105"/>
-          <w:lang w:val="en-GB"/>
-        </w:rPr>
-        <w:t>figures, or tables</w:t>
-      </w:r>
-      <w:r>
-        <w:rPr>
-          <w:rFonts w:ascii="Georgia" w:hAnsi="Georgia"/>
-          <w:w w:val="105"/>
-          <w:lang w:val="en-GB"/>
-        </w:rPr>
-        <w:t>.</w:t>
+        <w:t>the bibliography, figures, or tables.</w:t>
       </w:r>
     </w:p>
     <w:p>
@@ -6150,23 +5804,7 @@
           <w:w w:val="105"/>
           <w:lang w:val="en-GB"/>
         </w:rPr>
-        <w:t xml:space="preserve">ia are given in Section </w:t>
-      </w:r>
-      <w:r>
-        <w:rPr>
-          <w:rFonts w:eastAsia="Palatino Linotype" w:cs="Palatino Linotype" w:ascii="Georgia" w:hAnsi="Georgia"/>
-          <w:w w:val="105"/>
-          <w:lang w:val="en-GB"/>
-        </w:rPr>
-        <w:t>9</w:t>
-      </w:r>
-      <w:r>
-        <w:rPr>
-          <w:rFonts w:eastAsia="Palatino Linotype" w:cs="Palatino Linotype" w:ascii="Georgia" w:hAnsi="Georgia"/>
-          <w:w w:val="105"/>
-          <w:lang w:val="en-GB"/>
-        </w:rPr>
-        <w:t>.</w:t>
+        <w:t>ia are given in Section 9.</w:t>
       </w:r>
     </w:p>
     <w:p>
@@ -6187,23 +5825,7 @@
           <w:w w:val="105"/>
           <w:lang w:val="en-GB"/>
         </w:rPr>
-        <w:t xml:space="preserve">The report must be written using RMarkdown in RStudio. Both the .Rmd source file and the compiled .html </w:t>
-      </w:r>
-      <w:r>
-        <w:rPr>
-          <w:rFonts w:ascii="Georgia" w:hAnsi="Georgia"/>
-          <w:w w:val="105"/>
-          <w:lang w:val="en-GB"/>
-        </w:rPr>
-        <w:t xml:space="preserve">or .pdf </w:t>
-      </w:r>
-      <w:r>
-        <w:rPr>
-          <w:rFonts w:ascii="Georgia" w:hAnsi="Georgia"/>
-          <w:w w:val="105"/>
-          <w:lang w:val="en-GB"/>
-        </w:rPr>
-        <w:t>document must be submitted.</w:t>
+        <w:t>The report must be written using RMarkdown in RStudio. Both the .Rmd source file and the compiled .html or .pdf document must be submitted.</w:t>
       </w:r>
     </w:p>
     <w:p>
@@ -6306,15 +5928,7 @@
           <w:spacing w:val="1"/>
           <w:lang w:val="en-GB"/>
         </w:rPr>
-        <w:t xml:space="preserve"> </w:t>
-      </w:r>
-      <w:r>
-        <w:rPr>
-          <w:rFonts w:ascii="Georgia" w:hAnsi="Georgia"/>
-          <w:spacing w:val="1"/>
-          <w:lang w:val="en-GB"/>
-        </w:rPr>
-        <w:t>6</w:t>
+        <w:t xml:space="preserve"> 6</w:t>
       </w:r>
       <w:r>
         <w:rPr>
@@ -7211,7 +6825,7 @@
       <w:hyperlink w:anchor="_bookmark19">
         <w:r>
           <w:rPr>
-            <w:rStyle w:val="ListLabel183"/>
+            <w:rStyle w:val="ListLabel101"/>
             <w:rFonts w:ascii="Georgia" w:hAnsi="Georgia"/>
             <w:color w:val="660066"/>
             <w:w w:val="105"/>
@@ -7857,16 +7471,7 @@
           <w:w w:val="105"/>
           <w:lang w:val="en-GB"/>
         </w:rPr>
-        <w:t xml:space="preserve"> </w:t>
-      </w:r>
-      <w:r>
-        <w:rPr>
-          <w:rFonts w:ascii="Georgia" w:hAnsi="Georgia"/>
-          <w:spacing w:val="-9"/>
-          <w:w w:val="105"/>
-          <w:lang w:val="en-GB"/>
-        </w:rPr>
-        <w:t>the postgraduate student support</w:t>
+        <w:t xml:space="preserve"> the postgraduate student support</w:t>
       </w:r>
       <w:r>
         <w:rPr>
@@ -7898,39 +7503,39 @@
           <w:lang w:val="en-GB"/>
         </w:rPr>
       </w:pPr>
-      <w:bookmarkStart w:id="32" w:name="__RefHeading___Toc5946_3067524283"/>
-      <w:bookmarkStart w:id="33" w:name="_Toc219548402"/>
-      <w:bookmarkStart w:id="34" w:name="Mitigating_Circumstances"/>
+      <w:bookmarkStart w:id="31" w:name="__RefHeading___Toc5946_3067524283"/>
+      <w:bookmarkStart w:id="32" w:name="_Toc219548402"/>
+      <w:bookmarkStart w:id="33" w:name="Mitigating_Circumstances"/>
+      <w:bookmarkEnd w:id="31"/>
+      <w:bookmarkEnd w:id="33"/>
+      <w:r>
+        <w:rPr>
+          <w:rFonts w:ascii="Georgia" w:hAnsi="Georgia"/>
+          <w:lang w:val="en-GB"/>
+        </w:rPr>
+        <w:t>Mitigating</w:t>
+      </w:r>
+      <w:r>
+        <w:rPr>
+          <w:rFonts w:ascii="Georgia" w:hAnsi="Georgia"/>
+          <w:spacing w:val="93"/>
+          <w:lang w:val="en-GB"/>
+        </w:rPr>
+        <w:t xml:space="preserve"> </w:t>
+      </w:r>
+      <w:r>
+        <w:rPr>
+          <w:rFonts w:ascii="Georgia" w:hAnsi="Georgia"/>
+          <w:lang w:val="en-GB"/>
+        </w:rPr>
+        <w:t>Circumstances</w:t>
+      </w:r>
       <w:bookmarkEnd w:id="32"/>
-      <w:bookmarkEnd w:id="34"/>
-      <w:r>
-        <w:rPr>
-          <w:rFonts w:ascii="Georgia" w:hAnsi="Georgia"/>
-          <w:lang w:val="en-GB"/>
-        </w:rPr>
-        <w:t>Mitigating</w:t>
-      </w:r>
-      <w:r>
-        <w:rPr>
-          <w:rFonts w:ascii="Georgia" w:hAnsi="Georgia"/>
-          <w:spacing w:val="93"/>
-          <w:lang w:val="en-GB"/>
-        </w:rPr>
-        <w:t xml:space="preserve"> </w:t>
-      </w:r>
-      <w:r>
-        <w:rPr>
-          <w:rFonts w:ascii="Georgia" w:hAnsi="Georgia"/>
-          <w:lang w:val="en-GB"/>
-        </w:rPr>
-        <w:t>Circumstances</w:t>
-      </w:r>
-      <w:bookmarkEnd w:id="33"/>
     </w:p>
     <w:p>
       <w:pPr>
         <w:pStyle w:val="BodyText"/>
-        <w:spacing w:lineRule="auto" w:line="254" w:before="227" w:after="0"/>
+        <w:spacing w:lineRule="auto" w:line="252" w:before="227" w:after="0"/>
         <w:ind w:left="119" w:right="119"/>
         <w:jc w:val="both"/>
         <w:rPr>
@@ -8197,23 +7802,7 @@
           <w:w w:val="105"/>
           <w:lang w:val="en-GB"/>
         </w:rPr>
-        <w:t xml:space="preserve">submitted </w:t>
-      </w:r>
-      <w:r>
-        <w:rPr>
-          <w:rFonts w:ascii="Georgia" w:hAnsi="Georgia"/>
-          <w:w w:val="105"/>
-          <w:lang w:val="en-GB"/>
-        </w:rPr>
-        <w:t>to the School (not to the instructors!)</w:t>
-      </w:r>
-      <w:r>
-        <w:rPr>
-          <w:rFonts w:ascii="Georgia" w:hAnsi="Georgia"/>
-          <w:w w:val="105"/>
-          <w:lang w:val="en-GB"/>
-        </w:rPr>
-        <w:t>. Full guidance on</w:t>
+        <w:t>submitted to the School (not to the instructors!). Full guidance on</w:t>
       </w:r>
       <w:r>
         <w:rPr>
@@ -8295,7 +7884,7 @@
       <w:hyperlink r:id="rId4">
         <w:r>
           <w:rPr>
-            <w:rStyle w:val="ListLabel186"/>
+            <w:rStyle w:val="ListLabel102"/>
             <w:rFonts w:ascii="Georgia" w:hAnsi="Georgia"/>
             <w:b/>
             <w:color w:val="660066"/>
@@ -8326,19 +7915,19 @@
           <w:lang w:val="en-GB"/>
         </w:rPr>
       </w:pPr>
-      <w:bookmarkStart w:id="35" w:name="__RefHeading___Toc5948_3067524283"/>
-      <w:bookmarkStart w:id="36" w:name="_Toc219548403"/>
-      <w:bookmarkStart w:id="37" w:name="Feedback"/>
+      <w:bookmarkStart w:id="34" w:name="__RefHeading___Toc5948_3067524283"/>
+      <w:bookmarkStart w:id="35" w:name="_Toc219548403"/>
+      <w:bookmarkStart w:id="36" w:name="Feedback"/>
+      <w:bookmarkEnd w:id="34"/>
+      <w:bookmarkEnd w:id="36"/>
+      <w:r>
+        <w:rPr>
+          <w:rFonts w:ascii="Georgia" w:hAnsi="Georgia"/>
+          <w:lang w:val="en-GB"/>
+        </w:rPr>
+        <w:t>Feedback</w:t>
+      </w:r>
       <w:bookmarkEnd w:id="35"/>
-      <w:bookmarkEnd w:id="37"/>
-      <w:r>
-        <w:rPr>
-          <w:rFonts w:ascii="Georgia" w:hAnsi="Georgia"/>
-          <w:lang w:val="en-GB"/>
-        </w:rPr>
-        <w:t>Feedback</w:t>
-      </w:r>
-      <w:bookmarkEnd w:id="36"/>
     </w:p>
     <w:p>
       <w:pPr>
@@ -9202,16 +8791,7 @@
           <w:w w:val="105"/>
           <w:lang w:val="en-GB"/>
         </w:rPr>
-        <w:t xml:space="preserve"> </w:t>
-      </w:r>
-      <w:r>
-        <w:rPr>
-          <w:rFonts w:ascii="Georgia" w:hAnsi="Georgia"/>
-          <w:spacing w:val="-2"/>
-          <w:w w:val="105"/>
-          <w:lang w:val="en-GB"/>
-        </w:rPr>
-        <w:t>practicals, and drop-ins</w:t>
+        <w:t xml:space="preserve"> practicals, and drop-ins</w:t>
       </w:r>
       <w:r>
         <w:rPr>
@@ -9802,8 +9382,8 @@
           <w:lang w:val="en-GB"/>
         </w:rPr>
       </w:pPr>
-      <w:bookmarkStart w:id="38" w:name="Your_Feedback_to_Us"/>
-      <w:bookmarkEnd w:id="38"/>
+      <w:bookmarkStart w:id="37" w:name="Your_Feedback_to_Us"/>
+      <w:bookmarkEnd w:id="37"/>
       <w:r>
         <w:rPr>
           <w:rFonts w:ascii="Georgia" w:hAnsi="Georgia"/>
@@ -11006,34 +10586,34 @@
           <w:lang w:val="en-GB"/>
         </w:rPr>
       </w:pPr>
-      <w:bookmarkStart w:id="39" w:name="__RefHeading___Toc5950_3067524283"/>
-      <w:bookmarkStart w:id="40" w:name="_Toc219548404"/>
-      <w:bookmarkStart w:id="41" w:name="Your_Commitment"/>
+      <w:bookmarkStart w:id="38" w:name="__RefHeading___Toc5950_3067524283"/>
+      <w:bookmarkStart w:id="39" w:name="_Toc219548404"/>
+      <w:bookmarkStart w:id="40" w:name="Your_Commitment"/>
+      <w:bookmarkEnd w:id="38"/>
+      <w:bookmarkEnd w:id="40"/>
+      <w:r>
+        <w:rPr>
+          <w:rFonts w:ascii="Georgia" w:hAnsi="Georgia"/>
+          <w:lang w:val="en-GB"/>
+        </w:rPr>
+        <w:t>Your</w:t>
+      </w:r>
+      <w:r>
+        <w:rPr>
+          <w:rFonts w:ascii="Georgia" w:hAnsi="Georgia"/>
+          <w:spacing w:val="48"/>
+          <w:lang w:val="en-GB"/>
+        </w:rPr>
+        <w:t xml:space="preserve"> </w:t>
+      </w:r>
+      <w:r>
+        <w:rPr>
+          <w:rFonts w:ascii="Georgia" w:hAnsi="Georgia"/>
+          <w:lang w:val="en-GB"/>
+        </w:rPr>
+        <w:t>Commitment</w:t>
+      </w:r>
       <w:bookmarkEnd w:id="39"/>
-      <w:bookmarkEnd w:id="41"/>
-      <w:r>
-        <w:rPr>
-          <w:rFonts w:ascii="Georgia" w:hAnsi="Georgia"/>
-          <w:lang w:val="en-GB"/>
-        </w:rPr>
-        <w:t>Your</w:t>
-      </w:r>
-      <w:r>
-        <w:rPr>
-          <w:rFonts w:ascii="Georgia" w:hAnsi="Georgia"/>
-          <w:spacing w:val="48"/>
-          <w:lang w:val="en-GB"/>
-        </w:rPr>
-        <w:t xml:space="preserve"> </w:t>
-      </w:r>
-      <w:r>
-        <w:rPr>
-          <w:rFonts w:ascii="Georgia" w:hAnsi="Georgia"/>
-          <w:lang w:val="en-GB"/>
-        </w:rPr>
-        <w:t>Commitment</w:t>
-      </w:r>
-      <w:bookmarkEnd w:id="40"/>
     </w:p>
     <w:p>
       <w:pPr>
@@ -11048,8 +10628,8 @@
           <w:lang w:val="en-GB"/>
         </w:rPr>
       </w:pPr>
-      <w:bookmarkStart w:id="42" w:name="__RefHeading___Toc5952_3067524283"/>
-      <w:bookmarkEnd w:id="42"/>
+      <w:bookmarkStart w:id="41" w:name="__RefHeading___Toc5952_3067524283"/>
+      <w:bookmarkEnd w:id="41"/>
       <w:r>
         <w:rPr>
           <w:rFonts w:ascii="Georgia" w:hAnsi="Georgia"/>
@@ -11074,28 +10654,7 @@
           <w:rFonts w:ascii="Georgia" w:hAnsi="Georgia"/>
           <w:lang w:val="en-GB"/>
         </w:rPr>
-        <w:t xml:space="preserve">It is expected that you thoroughly read and prepare the weekly reading </w:t>
-      </w:r>
-      <w:r>
-        <w:rPr>
-          <w:rFonts w:ascii="Georgia" w:hAnsi="Georgia"/>
-          <w:lang w:val="en-GB"/>
-        </w:rPr>
-        <w:t>assignment</w:t>
-      </w:r>
-      <w:r>
-        <w:rPr>
-          <w:rFonts w:ascii="Georgia" w:hAnsi="Georgia"/>
-          <w:lang w:val="en-GB"/>
-        </w:rPr>
-        <w:t xml:space="preserve">s. A separate document on Canvas lists the weekly reading assignments. The lecture will then summarise key aspects of the readings, discuss perspectives, and fill in any necessary contents not provided by the readings. Merely attending the lectures without preparing the readings is not sufficient. You are expected to spend considerable time each week on preparation. </w:t>
-      </w:r>
-      <w:r>
-        <w:rPr>
-          <w:rFonts w:ascii="Georgia" w:hAnsi="Georgia"/>
-          <w:lang w:val="en-GB"/>
-        </w:rPr>
-        <w:t>Please feel free to ask questions about the readings during the lecture. Do not rely on AI summaries. Only close reading in combination with practical application can help you learn the contents thoroughly. During lectures and while reading, please take notes for yourself to support your learning.</w:t>
+        <w:t>It is expected that you thoroughly read and prepare the weekly reading assignments. A separate document on Canvas lists the weekly reading assignments. The lecture will then summarise key aspects of the readings, discuss perspectives, and fill in any necessary contents not provided by the readings. Merely attending the lectures without preparing the readings is not sufficient. You are expected to spend considerable time each week on preparation. Please feel free to ask questions about the readings during the lecture. Do not rely on AI summaries. Only close reading in combination with practical application can help you learn the contents thoroughly. During lectures and while reading, please take notes for yourself to support your learning.</w:t>
       </w:r>
     </w:p>
     <w:p>
@@ -11111,34 +10670,34 @@
           <w:lang w:val="en-GB"/>
         </w:rPr>
       </w:pPr>
-      <w:bookmarkStart w:id="43" w:name="__RefHeading___Toc5954_3067524283"/>
-      <w:bookmarkStart w:id="44" w:name="Practicals%3A_Preparation"/>
-      <w:bookmarkStart w:id="45" w:name="_Toc219548406"/>
+      <w:bookmarkStart w:id="42" w:name="__RefHeading___Toc5954_3067524283"/>
+      <w:bookmarkStart w:id="43" w:name="_Toc219548406"/>
+      <w:bookmarkStart w:id="44" w:name="Practicals%253A_Preparation"/>
+      <w:bookmarkEnd w:id="42"/>
+      <w:bookmarkEnd w:id="44"/>
+      <w:r>
+        <w:rPr>
+          <w:rFonts w:ascii="Georgia" w:hAnsi="Georgia"/>
+          <w:lang w:val="en-GB"/>
+        </w:rPr>
+        <w:t>Workshops:</w:t>
+      </w:r>
+      <w:r>
+        <w:rPr>
+          <w:rFonts w:ascii="Georgia" w:hAnsi="Georgia"/>
+          <w:spacing w:val="17"/>
+          <w:lang w:val="en-GB"/>
+        </w:rPr>
+        <w:t xml:space="preserve"> </w:t>
+      </w:r>
+      <w:r>
+        <w:rPr>
+          <w:rFonts w:ascii="Georgia" w:hAnsi="Georgia"/>
+          <w:lang w:val="en-GB"/>
+        </w:rPr>
+        <w:t>Preparation</w:t>
+      </w:r>
       <w:bookmarkEnd w:id="43"/>
-      <w:bookmarkEnd w:id="44"/>
-      <w:r>
-        <w:rPr>
-          <w:rFonts w:ascii="Georgia" w:hAnsi="Georgia"/>
-          <w:lang w:val="en-GB"/>
-        </w:rPr>
-        <w:t>Workshops:</w:t>
-      </w:r>
-      <w:r>
-        <w:rPr>
-          <w:rFonts w:ascii="Georgia" w:hAnsi="Georgia"/>
-          <w:spacing w:val="17"/>
-          <w:lang w:val="en-GB"/>
-        </w:rPr>
-        <w:t xml:space="preserve"> </w:t>
-      </w:r>
-      <w:r>
-        <w:rPr>
-          <w:rFonts w:ascii="Georgia" w:hAnsi="Georgia"/>
-          <w:lang w:val="en-GB"/>
-        </w:rPr>
-        <w:t>Preparation</w:t>
-      </w:r>
-      <w:bookmarkEnd w:id="45"/>
     </w:p>
     <w:p>
       <w:pPr>
@@ -11299,7 +10858,14 @@
           <w:spacing w:val="1"/>
           <w:lang w:val="en-GB"/>
         </w:rPr>
-        <w:t xml:space="preserve"> </w:t>
+        <w:t xml:space="preserve"> them depends </w:t>
+      </w:r>
+      <w:r>
+        <w:rPr>
+          <w:rFonts w:ascii="Georgia" w:hAnsi="Georgia"/>
+          <w:lang w:val="en-GB"/>
+        </w:rPr>
+        <w:t>on</w:t>
       </w:r>
       <w:r>
         <w:rPr>
@@ -11307,14 +10873,14 @@
           <w:spacing w:val="1"/>
           <w:lang w:val="en-GB"/>
         </w:rPr>
-        <w:t xml:space="preserve">them depends </w:t>
-      </w:r>
-      <w:r>
-        <w:rPr>
-          <w:rFonts w:ascii="Georgia" w:hAnsi="Georgia"/>
-          <w:lang w:val="en-GB"/>
-        </w:rPr>
-        <w:t>on</w:t>
+        <w:t xml:space="preserve"> </w:t>
+      </w:r>
+      <w:r>
+        <w:rPr>
+          <w:rFonts w:ascii="Georgia" w:hAnsi="Georgia"/>
+          <w:lang w:val="en-GB"/>
+        </w:rPr>
+        <w:t>your</w:t>
       </w:r>
       <w:r>
         <w:rPr>
@@ -11329,21 +10895,6 @@
           <w:rFonts w:ascii="Georgia" w:hAnsi="Georgia"/>
           <w:lang w:val="en-GB"/>
         </w:rPr>
-        <w:t>your</w:t>
-      </w:r>
-      <w:r>
-        <w:rPr>
-          <w:rFonts w:ascii="Georgia" w:hAnsi="Georgia"/>
-          <w:spacing w:val="1"/>
-          <w:lang w:val="en-GB"/>
-        </w:rPr>
-        <w:t xml:space="preserve"> </w:t>
-      </w:r>
-      <w:r>
-        <w:rPr>
-          <w:rFonts w:ascii="Georgia" w:hAnsi="Georgia"/>
-          <w:lang w:val="en-GB"/>
-        </w:rPr>
         <w:t>preparation</w:t>
       </w:r>
       <w:r>
@@ -11404,28 +10955,7 @@
           <w:rFonts w:ascii="Georgia" w:hAnsi="Georgia"/>
           <w:lang w:val="en-GB"/>
         </w:rPr>
-        <w:t xml:space="preserve">participate. </w:t>
-      </w:r>
-      <w:r>
-        <w:rPr>
-          <w:rFonts w:ascii="Georgia" w:hAnsi="Georgia"/>
-          <w:lang w:val="en-GB"/>
-        </w:rPr>
-        <w:t>It is essential that you follow the practical presentation attentively, replicate the analysis steps on the lab computer or your own laptop, and ask questions when necessary</w:t>
-      </w:r>
-      <w:r>
-        <w:rPr>
-          <w:rFonts w:ascii="Georgia" w:hAnsi="Georgia"/>
-          <w:lang w:val="en-GB"/>
-        </w:rPr>
-        <w:t xml:space="preserve">. </w:t>
-      </w:r>
-      <w:r>
-        <w:rPr>
-          <w:rFonts w:ascii="Georgia" w:hAnsi="Georgia"/>
-          <w:lang w:val="en-GB"/>
-        </w:rPr>
-        <w:t>You are encouraged to complete the exercises during and after practicals in groups. The practicals serve to start the exercises, and you are expected to complete them outside of the practical contact hours, alone or with others, and check your own learning progress. Do not rely on AI to solve the exercises as this will not support your learning.</w:t>
+        <w:t>participate. It is essential that you follow the practical presentation attentively, replicate the analysis steps on the lab computer or your own laptop, and ask questions when necessary. You are encouraged to complete the exercises during and after practicals in groups. The practicals serve to start the exercises, and you are expected to complete them outside of the practical contact hours, alone or with others, and check your own learning progress. Do not rely on AI to solve the exercises as this will not support your learning.</w:t>
       </w:r>
     </w:p>
     <w:p>
@@ -11441,32 +10971,25 @@
           <w:lang w:val="en-GB"/>
         </w:rPr>
       </w:pPr>
-      <w:bookmarkStart w:id="46" w:name="__RefHeading___Toc5956_3067524283"/>
-      <w:bookmarkStart w:id="47" w:name="_Toc219548407"/>
-      <w:bookmarkStart w:id="48" w:name="Attendance"/>
+      <w:bookmarkStart w:id="45" w:name="__RefHeading___Toc5956_3067524283"/>
+      <w:bookmarkStart w:id="46" w:name="_Toc219548407"/>
+      <w:bookmarkStart w:id="47" w:name="Attendance"/>
+      <w:bookmarkEnd w:id="45"/>
+      <w:bookmarkEnd w:id="47"/>
+      <w:r>
+        <w:rPr>
+          <w:rFonts w:ascii="Georgia" w:hAnsi="Georgia"/>
+          <w:lang w:val="en-GB"/>
+        </w:rPr>
+        <w:t>Attendance</w:t>
+      </w:r>
       <w:bookmarkEnd w:id="46"/>
-      <w:bookmarkEnd w:id="48"/>
-      <w:r>
-        <w:rPr>
-          <w:rFonts w:ascii="Georgia" w:hAnsi="Georgia"/>
-          <w:lang w:val="en-GB"/>
-        </w:rPr>
-        <w:t>Attendance</w:t>
-      </w:r>
-      <w:bookmarkEnd w:id="47"/>
-      <w:r>
-        <w:rPr>
-          <w:rFonts w:ascii="Georgia" w:hAnsi="Georgia"/>
-          <w:lang w:val="en-GB"/>
-        </w:rPr>
-        <w:t xml:space="preserve"> </w:t>
-      </w:r>
-      <w:r>
-        <w:rPr>
-          <w:rFonts w:ascii="Georgia" w:hAnsi="Georgia"/>
-          <w:lang w:val="en-GB"/>
-        </w:rPr>
-        <w:t>and absences</w:t>
+      <w:r>
+        <w:rPr>
+          <w:rFonts w:ascii="Georgia" w:hAnsi="Georgia"/>
+          <w:lang w:val="en-GB"/>
+        </w:rPr>
+        <w:t xml:space="preserve"> and absences</w:t>
       </w:r>
     </w:p>
     <w:p>
@@ -11485,21 +11008,7 @@
           <w:rFonts w:ascii="Georgia" w:hAnsi="Georgia"/>
           <w:lang w:val="en-GB"/>
         </w:rPr>
-        <w:t xml:space="preserve">You are expected to attend all lectures and </w:t>
-      </w:r>
-      <w:r>
-        <w:rPr>
-          <w:rFonts w:ascii="Georgia" w:hAnsi="Georgia"/>
-          <w:lang w:val="en-GB"/>
-        </w:rPr>
-        <w:t>practicals</w:t>
-      </w:r>
-      <w:r>
-        <w:rPr>
-          <w:rFonts w:ascii="Georgia" w:hAnsi="Georgia"/>
-          <w:lang w:val="en-GB"/>
-        </w:rPr>
-        <w:t xml:space="preserve"> that are part of your programme.</w:t>
+        <w:t>You are expected to attend all lectures and practicals that are part of your programme.</w:t>
       </w:r>
       <w:r>
         <w:rPr>
@@ -12283,21 +11792,7 @@
           <w:rFonts w:ascii="Georgia" w:hAnsi="Georgia"/>
           <w:lang w:val="en-GB"/>
         </w:rPr>
-        <w:t xml:space="preserve">a </w:t>
-      </w:r>
-      <w:r>
-        <w:rPr>
-          <w:rFonts w:ascii="Georgia" w:hAnsi="Georgia"/>
-          <w:lang w:val="en-GB"/>
-        </w:rPr>
-        <w:t>session</w:t>
-      </w:r>
-      <w:r>
-        <w:rPr>
-          <w:rFonts w:ascii="Georgia" w:hAnsi="Georgia"/>
-          <w:lang w:val="en-GB"/>
-        </w:rPr>
-        <w:t xml:space="preserve"> because</w:t>
+        <w:t>a session because</w:t>
       </w:r>
       <w:r>
         <w:rPr>
@@ -13230,8 +12725,8 @@
           <w:lang w:val="en-GB"/>
         </w:rPr>
       </w:pPr>
-      <w:bookmarkStart w:id="49" w:name="__RefHeading___Toc5958_3067524283"/>
-      <w:bookmarkEnd w:id="49"/>
+      <w:bookmarkStart w:id="48" w:name="__RefHeading___Toc5958_3067524283"/>
+      <w:bookmarkEnd w:id="48"/>
       <w:r>
         <w:rPr>
           <w:rFonts w:ascii="Georgia" w:hAnsi="Georgia"/>
@@ -13275,49 +12770,49 @@
           <w:lang w:val="en-GB"/>
         </w:rPr>
       </w:pPr>
-      <w:bookmarkStart w:id="50" w:name="__RefHeading___Toc5960_3067524283"/>
-      <w:bookmarkStart w:id="51" w:name="_Toc219548409_Copy_1"/>
-      <w:bookmarkStart w:id="52" w:name="Email_and_Blackboard_Copy_1"/>
+      <w:bookmarkStart w:id="49" w:name="__RefHeading___Toc5960_3067524283"/>
+      <w:bookmarkStart w:id="50" w:name="_Toc219548409_Copy_1"/>
+      <w:bookmarkStart w:id="51" w:name="Email_and_Blackboard_Copy_1"/>
+      <w:bookmarkEnd w:id="49"/>
+      <w:bookmarkEnd w:id="51"/>
+      <w:r>
+        <w:rPr>
+          <w:rFonts w:ascii="Georgia" w:hAnsi="Georgia"/>
+          <w:lang w:val="en-GB"/>
+        </w:rPr>
+        <w:t>Email</w:t>
+      </w:r>
+      <w:r>
+        <w:rPr>
+          <w:rFonts w:ascii="Georgia" w:hAnsi="Georgia"/>
+          <w:spacing w:val="6"/>
+          <w:lang w:val="en-GB"/>
+        </w:rPr>
+        <w:t xml:space="preserve"> </w:t>
+      </w:r>
+      <w:r>
+        <w:rPr>
+          <w:rFonts w:ascii="Georgia" w:hAnsi="Georgia"/>
+          <w:lang w:val="en-GB"/>
+        </w:rPr>
+        <w:t>and</w:t>
+      </w:r>
+      <w:r>
+        <w:rPr>
+          <w:rFonts w:ascii="Georgia" w:hAnsi="Georgia"/>
+          <w:spacing w:val="6"/>
+          <w:lang w:val="en-GB"/>
+        </w:rPr>
+        <w:t xml:space="preserve"> </w:t>
+      </w:r>
+      <w:r>
+        <w:rPr>
+          <w:rFonts w:ascii="Georgia" w:hAnsi="Georgia"/>
+          <w:lang w:val="en-GB"/>
+        </w:rPr>
+        <w:t>Canvas</w:t>
+      </w:r>
       <w:bookmarkEnd w:id="50"/>
-      <w:bookmarkEnd w:id="52"/>
-      <w:r>
-        <w:rPr>
-          <w:rFonts w:ascii="Georgia" w:hAnsi="Georgia"/>
-          <w:lang w:val="en-GB"/>
-        </w:rPr>
-        <w:t>Email</w:t>
-      </w:r>
-      <w:r>
-        <w:rPr>
-          <w:rFonts w:ascii="Georgia" w:hAnsi="Georgia"/>
-          <w:spacing w:val="6"/>
-          <w:lang w:val="en-GB"/>
-        </w:rPr>
-        <w:t xml:space="preserve"> </w:t>
-      </w:r>
-      <w:r>
-        <w:rPr>
-          <w:rFonts w:ascii="Georgia" w:hAnsi="Georgia"/>
-          <w:lang w:val="en-GB"/>
-        </w:rPr>
-        <w:t>and</w:t>
-      </w:r>
-      <w:r>
-        <w:rPr>
-          <w:rFonts w:ascii="Georgia" w:hAnsi="Georgia"/>
-          <w:spacing w:val="6"/>
-          <w:lang w:val="en-GB"/>
-        </w:rPr>
-        <w:t xml:space="preserve"> </w:t>
-      </w:r>
-      <w:r>
-        <w:rPr>
-          <w:rFonts w:ascii="Georgia" w:hAnsi="Georgia"/>
-          <w:lang w:val="en-GB"/>
-        </w:rPr>
-        <w:t>Canvas</w:t>
-      </w:r>
-      <w:bookmarkEnd w:id="51"/>
     </w:p>
     <w:p>
       <w:pPr>
@@ -13989,32 +13484,32 @@
           <w:lang w:val="en-GB"/>
         </w:rPr>
       </w:pPr>
-      <w:bookmarkStart w:id="53" w:name="__RefHeading___Toc5962_3067524283"/>
-      <w:bookmarkStart w:id="54" w:name="_Toc219548412"/>
+      <w:bookmarkStart w:id="52" w:name="__RefHeading___Toc5962_3067524283"/>
+      <w:bookmarkStart w:id="53" w:name="_Toc219548412"/>
+      <w:bookmarkEnd w:id="52"/>
+      <w:r>
+        <w:rPr>
+          <w:rFonts w:ascii="Georgia" w:hAnsi="Georgia"/>
+          <w:lang w:val="en-GB"/>
+        </w:rPr>
+        <w:t>Assessment</w:t>
+      </w:r>
+      <w:r>
+        <w:rPr>
+          <w:rFonts w:ascii="Georgia" w:hAnsi="Georgia"/>
+          <w:spacing w:val="86"/>
+          <w:lang w:val="en-GB"/>
+        </w:rPr>
+        <w:t xml:space="preserve"> </w:t>
+      </w:r>
+      <w:r>
+        <w:rPr>
+          <w:rFonts w:ascii="Georgia" w:hAnsi="Georgia"/>
+          <w:lang w:val="en-GB"/>
+        </w:rPr>
+        <w:t>Criteria</w:t>
+      </w:r>
       <w:bookmarkEnd w:id="53"/>
-      <w:r>
-        <w:rPr>
-          <w:rFonts w:ascii="Georgia" w:hAnsi="Georgia"/>
-          <w:lang w:val="en-GB"/>
-        </w:rPr>
-        <w:t>Assessment</w:t>
-      </w:r>
-      <w:r>
-        <w:rPr>
-          <w:rFonts w:ascii="Georgia" w:hAnsi="Georgia"/>
-          <w:spacing w:val="86"/>
-          <w:lang w:val="en-GB"/>
-        </w:rPr>
-        <w:t xml:space="preserve"> </w:t>
-      </w:r>
-      <w:r>
-        <w:rPr>
-          <w:rFonts w:ascii="Georgia" w:hAnsi="Georgia"/>
-          <w:lang w:val="en-GB"/>
-        </w:rPr>
-        <w:t>Criteria</w:t>
-      </w:r>
-      <w:bookmarkEnd w:id="54"/>
     </w:p>
     <w:p>
       <w:pPr>
@@ -14503,7 +13998,7 @@
   <w:p>
     <w:pPr>
       <w:pStyle w:val="BodyText"/>
-      <w:spacing w:lineRule="auto" w:line="12"/>
+      <w:spacing w:lineRule="auto" w:line="9"/>
       <w:ind w:left="0"/>
       <w:rPr>
         <w:sz w:val="20"/>
@@ -14513,12 +14008,10 @@
       <w:rPr>
         <w:sz w:val="20"/>
       </w:rPr>
-    </w:r>
-    <w:r>
       <mc:AlternateContent>
         <mc:Choice Requires="wps">
           <w:drawing>
-            <wp:anchor behindDoc="1" distT="0" distB="0" distL="114300" distR="114300" simplePos="0" locked="0" layoutInCell="0" allowOverlap="1" relativeHeight="15">
+            <wp:anchor behindDoc="1" distT="0" distB="0" distL="0" distR="0" simplePos="0" locked="0" layoutInCell="0" allowOverlap="1" relativeHeight="21">
               <wp:simplePos x="0" y="0"/>
               <wp:positionH relativeFrom="page">
                 <wp:posOffset>3683000</wp:posOffset>
@@ -14533,19 +14026,26 @@
               <a:graphic xmlns:a="http://schemas.openxmlformats.org/drawingml/2006/main">
                 <a:graphicData uri="http://schemas.microsoft.com/office/word/2010/wordprocessingShape">
                   <wps:wsp>
-                    <wps:cNvSpPr txBox="1"/>
+                    <wps:cNvSpPr/>
                     <wps:spPr>
                       <a:xfrm>
                         <a:off x="0" y="0"/>
-                        <a:ext cx="419100" cy="180975"/>
+                        <a:ext cx="419040" cy="181080"/>
                       </a:xfrm>
-                      <a:prstGeom prst="rect"/>
-                      <a:solidFill>
-                        <a:srgbClr val="FFFFFF">
-                          <a:alpha val="0"/>
-                        </a:srgbClr>
-                      </a:solidFill>
+                      <a:prstGeom prst="rect">
+                        <a:avLst/>
+                      </a:prstGeom>
+                      <a:noFill/>
+                      <a:ln w="0">
+                        <a:noFill/>
+                      </a:ln>
                     </wps:spPr>
+                    <wps:style>
+                      <a:lnRef idx="0"/>
+                      <a:fillRef idx="0"/>
+                      <a:effectRef idx="0"/>
+                      <a:fontRef idx="minor"/>
+                    </wps:style>
                     <wps:txbx>
                       <w:txbxContent>
                         <w:p>
@@ -14586,7 +14086,7 @@
                         </w:p>
                       </w:txbxContent>
                     </wps:txbx>
-                    <wps:bodyPr anchor="t" lIns="0" tIns="0" rIns="0" bIns="0">
+                    <wps:bodyPr lIns="0" rIns="0" tIns="0" bIns="0" anchor="t">
                       <a:noAutofit/>
                     </wps:bodyPr>
                   </wps:wsp>
@@ -14597,8 +14097,10 @@
         </mc:Choice>
         <mc:Fallback>
           <w:pict>
-            <v:rect stroked="f" strokeweight="0pt" style="position:absolute;rotation:-0;width:33pt;height:14.25pt;mso-wrap-distance-left:9pt;mso-wrap-distance-right:9pt;mso-wrap-distance-top:0pt;mso-wrap-distance-bottom:0pt;margin-top:739.5pt;mso-position-vertical-relative:page;margin-left:290pt;mso-position-horizontal-relative:page">
-              <v:textbox inset="0in,0in,0in,0in">
+            <v:rect id="shape_0" ID="Frame3" path="m0,0l-2147483645,0l-2147483645,-2147483646l0,-2147483646xe" fillcolor="white" stroked="f" o:allowincell="f" style="position:absolute;margin-left:290pt;margin-top:739.5pt;width:32.95pt;height:14.2pt;mso-wrap-style:square;v-text-anchor:top;mso-position-horizontal-relative:page;mso-position-vertical-relative:page">
+              <v:fill o:detectmouseclick="t" type="solid" color2="black" opacity="0"/>
+              <v:stroke color="#3465a4" joinstyle="round" endcap="flat"/>
+              <v:textbox>
                 <w:txbxContent>
                   <w:p>
                     <w:pPr>
@@ -14653,7 +14155,7 @@
   <w:p>
     <w:pPr>
       <w:pStyle w:val="BodyText"/>
-      <w:spacing w:lineRule="auto" w:line="12"/>
+      <w:spacing w:lineRule="auto" w:line="9"/>
       <w:ind w:left="0"/>
       <w:rPr>
         <w:sz w:val="20"/>
@@ -14666,7 +14168,7 @@
       <mc:AlternateContent>
         <mc:Choice Requires="wps">
           <w:drawing>
-            <wp:anchor behindDoc="1" distT="0" distB="0" distL="114300" distR="114300" simplePos="0" locked="0" layoutInCell="0" allowOverlap="1" relativeHeight="8">
+            <wp:anchor behindDoc="1" distT="2540" distB="2540" distL="2540" distR="2540" simplePos="0" locked="0" layoutInCell="0" allowOverlap="1" relativeHeight="8">
               <wp:simplePos x="0" y="0"/>
               <wp:positionH relativeFrom="page">
                 <wp:posOffset>914400</wp:posOffset>
@@ -14674,10 +14176,10 @@
               <wp:positionV relativeFrom="page">
                 <wp:posOffset>737870</wp:posOffset>
               </wp:positionV>
-              <wp:extent cx="5943600" cy="0"/>
+              <wp:extent cx="5943600" cy="635"/>
               <wp:effectExtent l="2540" t="2540" r="2540" b="2540"/>
               <wp:wrapNone/>
-              <wp:docPr id="3" name=""/>
+              <wp:docPr id="3" name="Shape2"/>
               <a:graphic xmlns:a="http://schemas.openxmlformats.org/drawingml/2006/main">
                 <a:graphicData uri="http://schemas.microsoft.com/office/word/2010/wordprocessingShape">
                   <wps:wsp>
@@ -14685,7 +14187,7 @@
                     <wps:spPr>
                       <a:xfrm>
                         <a:off x="0" y="0"/>
-                        <a:ext cx="5943600" cy="0"/>
+                        <a:ext cx="5943600" cy="720"/>
                       </a:xfrm>
                       <a:prstGeom prst="line">
                         <a:avLst/>
@@ -14712,7 +14214,7 @@
         </mc:Choice>
         <mc:Fallback>
           <w:pict>
-            <v:line id="shape_0" from="72pt,58.1pt" to="539.95pt,58.1pt" stroked="t" o:allowincell="f" style="position:absolute;mso-position-horizontal-relative:page;mso-position-vertical-relative:page">
+            <v:line id="shape_0" from="72pt,58.1pt" to="539.95pt,58.1pt" ID="Shape2" stroked="t" o:allowincell="f" style="position:absolute;mso-position-horizontal-relative:page;mso-position-vertical-relative:page">
               <v:stroke color="black" weight="5040" joinstyle="round" endcap="flat"/>
               <v:fill o:detectmouseclick="t" on="false"/>
               <w10:wrap type="none"/>
@@ -14720,12 +14222,10 @@
           </w:pict>
         </mc:Fallback>
       </mc:AlternateContent>
-    </w:r>
-    <w:r>
       <mc:AlternateContent>
         <mc:Choice Requires="wps">
           <w:drawing>
-            <wp:anchor behindDoc="1" distT="0" distB="0" distL="114300" distR="114300" simplePos="0" locked="0" layoutInCell="0" allowOverlap="1" relativeHeight="22">
+            <wp:anchor behindDoc="1" distT="0" distB="0" distL="0" distR="0" simplePos="0" locked="0" layoutInCell="0" allowOverlap="1" relativeHeight="35">
               <wp:simplePos x="0" y="0"/>
               <wp:positionH relativeFrom="page">
                 <wp:posOffset>4005580</wp:posOffset>
@@ -14740,19 +14240,26 @@
               <a:graphic xmlns:a="http://schemas.openxmlformats.org/drawingml/2006/main">
                 <a:graphicData uri="http://schemas.microsoft.com/office/word/2010/wordprocessingShape">
                   <wps:wsp>
-                    <wps:cNvSpPr txBox="1"/>
+                    <wps:cNvSpPr/>
                     <wps:spPr>
                       <a:xfrm>
                         <a:off x="0" y="0"/>
-                        <a:ext cx="2865755" cy="165100"/>
+                        <a:ext cx="2865600" cy="165240"/>
                       </a:xfrm>
-                      <a:prstGeom prst="rect"/>
-                      <a:solidFill>
-                        <a:srgbClr val="FFFFFF">
-                          <a:alpha val="0"/>
-                        </a:srgbClr>
-                      </a:solidFill>
+                      <a:prstGeom prst="rect">
+                        <a:avLst/>
+                      </a:prstGeom>
+                      <a:noFill/>
+                      <a:ln w="0">
+                        <a:noFill/>
+                      </a:ln>
                     </wps:spPr>
+                    <wps:style>
+                      <a:lnRef idx="0"/>
+                      <a:fillRef idx="0"/>
+                      <a:effectRef idx="0"/>
+                      <a:fontRef idx="minor"/>
+                    </wps:style>
                     <wps:txbx>
                       <w:txbxContent>
                         <w:p>
@@ -14821,7 +14328,7 @@
                         </w:p>
                       </w:txbxContent>
                     </wps:txbx>
-                    <wps:bodyPr anchor="t" lIns="0" tIns="0" rIns="0" bIns="0">
+                    <wps:bodyPr lIns="0" rIns="0" tIns="0" bIns="0" anchor="t">
                       <a:noAutofit/>
                     </wps:bodyPr>
                   </wps:wsp>
@@ -14832,8 +14339,10 @@
         </mc:Choice>
         <mc:Fallback>
           <w:pict>
-            <v:rect stroked="f" strokeweight="0pt" style="position:absolute;rotation:-0;width:225.65pt;height:13pt;mso-wrap-distance-left:9pt;mso-wrap-distance-right:9pt;mso-wrap-distance-top:0pt;mso-wrap-distance-bottom:0pt;margin-top:45.15pt;mso-position-vertical-relative:page;margin-left:315.4pt;mso-position-horizontal-relative:page">
-              <v:textbox inset="0in,0in,0in,0in">
+            <v:rect id="shape_0" ID="Frame2" path="m0,0l-2147483645,0l-2147483645,-2147483646l0,-2147483646xe" fillcolor="white" stroked="f" o:allowincell="f" style="position:absolute;margin-left:315.4pt;margin-top:45.15pt;width:225.6pt;height:12.95pt;mso-wrap-style:square;v-text-anchor:top;mso-position-horizontal-relative:page;mso-position-vertical-relative:page">
+              <v:fill o:detectmouseclick="t" type="solid" color2="black" opacity="0"/>
+              <v:stroke color="#3465a4" joinstyle="round" endcap="flat"/>
+              <v:textbox>
                 <w:txbxContent>
                   <w:p>
                     <w:pPr>
@@ -14906,12 +14415,10 @@
           </w:pict>
         </mc:Fallback>
       </mc:AlternateContent>
-    </w:r>
-    <w:r>
       <mc:AlternateContent>
         <mc:Choice Requires="wps">
           <w:drawing>
-            <wp:anchor behindDoc="1" distT="0" distB="0" distL="114300" distR="114300" simplePos="0" locked="0" layoutInCell="0" allowOverlap="1" relativeHeight="29">
+            <wp:anchor behindDoc="1" distT="0" distB="0" distL="0" distR="0" simplePos="0" locked="0" layoutInCell="0" allowOverlap="1" relativeHeight="49">
               <wp:simplePos x="0" y="0"/>
               <wp:positionH relativeFrom="page">
                 <wp:posOffset>901700</wp:posOffset>
@@ -14926,19 +14433,26 @@
               <a:graphic xmlns:a="http://schemas.openxmlformats.org/drawingml/2006/main">
                 <a:graphicData uri="http://schemas.microsoft.com/office/word/2010/wordprocessingShape">
                   <wps:wsp>
-                    <wps:cNvSpPr txBox="1"/>
+                    <wps:cNvSpPr/>
                     <wps:spPr>
                       <a:xfrm>
                         <a:off x="0" y="0"/>
-                        <a:ext cx="844550" cy="165100"/>
+                        <a:ext cx="844560" cy="165240"/>
                       </a:xfrm>
-                      <a:prstGeom prst="rect"/>
-                      <a:solidFill>
-                        <a:srgbClr val="FFFFFF">
-                          <a:alpha val="0"/>
-                        </a:srgbClr>
-                      </a:solidFill>
+                      <a:prstGeom prst="rect">
+                        <a:avLst/>
+                      </a:prstGeom>
+                      <a:noFill/>
+                      <a:ln w="0">
+                        <a:noFill/>
+                      </a:ln>
                     </wps:spPr>
+                    <wps:style>
+                      <a:lnRef idx="0"/>
+                      <a:fillRef idx="0"/>
+                      <a:effectRef idx="0"/>
+                      <a:fontRef idx="minor"/>
+                    </wps:style>
                     <wps:txbx>
                       <w:txbxContent>
                         <w:p>
@@ -14975,7 +14489,7 @@
                         </w:p>
                       </w:txbxContent>
                     </wps:txbx>
-                    <wps:bodyPr anchor="t" lIns="0" tIns="0" rIns="0" bIns="0">
+                    <wps:bodyPr lIns="0" rIns="0" tIns="0" bIns="0" anchor="t">
                       <a:noAutofit/>
                     </wps:bodyPr>
                   </wps:wsp>
@@ -14986,8 +14500,10 @@
         </mc:Choice>
         <mc:Fallback>
           <w:pict>
-            <v:rect stroked="f" strokeweight="0pt" style="position:absolute;rotation:-0;width:66.5pt;height:13pt;mso-wrap-distance-left:9pt;mso-wrap-distance-right:9pt;mso-wrap-distance-top:0pt;mso-wrap-distance-bottom:0pt;margin-top:45.15pt;mso-position-vertical-relative:page;margin-left:71pt;mso-position-horizontal-relative:page">
-              <v:textbox inset="0in,0in,0in,0in">
+            <v:rect id="shape_0" ID="Frame1" path="m0,0l-2147483645,0l-2147483645,-2147483646l0,-2147483646xe" fillcolor="white" stroked="f" o:allowincell="f" style="position:absolute;margin-left:71pt;margin-top:45.15pt;width:66.45pt;height:12.95pt;mso-wrap-style:square;v-text-anchor:top;mso-position-horizontal-relative:page;mso-position-vertical-relative:page">
+              <v:fill o:detectmouseclick="t" type="solid" color2="black" opacity="0"/>
+              <v:stroke color="#3465a4" joinstyle="round" endcap="flat"/>
+              <v:textbox>
                 <w:txbxContent>
                   <w:p>
                     <w:pPr>
@@ -16979,6 +16495,7 @@
     <w:qFormat/>
     <w:pPr>
       <w:widowControl w:val="false"/>
+      <w:suppressAutoHyphens w:val="true"/>
       <w:bidi w:val="0"/>
       <w:spacing w:before="0" w:after="0"/>
       <w:jc w:val="left"/>

</xml_diff>